<commit_message>
Module deck: per-demo overview, steps, and one slide per prompt with an expected-output screenshot
build_modules_deck.py compiles the verified guides into 149 slides; module_manifest.py maps all 97
steps to a live capture (SQL checkpoints checked via capture_queries.py, Genie/KA answers, pages).
D2 guide expectations updated from the captures.

Co-authored-by: Isaac <no-reply@databricks.com>
</commit_message>
<xml_diff>
--- a/assets/click-path.docx
+++ b/assets/click-path.docx
@@ -2519,7 +2519,35 @@
         <w:t xml:space="preserve"> </w:t>
       </w:r>
       <w:r>
-        <w:t xml:space="preserve">bar chart: Office €46.7M, Multifamily €37.2M, Retail €19.7M (all quarters). Ask</w:t>
+        <w:t xml:space="preserve">bar chart for</w:t>
+      </w:r>
+      <w:r>
+        <w:t xml:space="preserve"> </w:t>
+      </w:r>
+      <w:r>
+        <w:rPr>
+          <w:b/>
+          <w:bCs/>
+        </w:rPr>
+        <w:t xml:space="preserve">2026-Q2</w:t>
+      </w:r>
+      <w:r>
+        <w:t xml:space="preserve"> </w:t>
+      </w:r>
+      <w:r>
+        <w:t xml:space="preserve">(the agent’s default period): Office €4.69M, Multifamily €3.96M, Retail €2.10M. Add</w:t>
+      </w:r>
+      <w:r>
+        <w:t xml:space="preserve"> </w:t>
+      </w:r>
+      <w:r>
+        <w:t xml:space="preserve">“across all quarters”</w:t>
+      </w:r>
+      <w:r>
+        <w:t xml:space="preserve"> </w:t>
+      </w:r>
+      <w:r>
+        <w:t xml:space="preserve">for the totals: Office €46.7M, Multifamily €37.2M, Retail €19.7M. Ask</w:t>
       </w:r>
       <w:r>
         <w:t xml:space="preserve"> </w:t>
@@ -2665,7 +2693,7 @@
         <w:t xml:space="preserve"> </w:t>
       </w:r>
       <w:r>
-        <w:t xml:space="preserve">target misses (€156k shortfall across 3 properties), one QoQ decline. Grounded but shallow.</w:t>
+        <w:t xml:space="preserve">target misses (€156k shortfall across 3 properties), the Harbor Tower QoQ decline, and (seen 2026-10-09) lease-expiry risk concentrated at Peachtree Center. Grounded; compare with the Reference agent, whose instructions add the business context.</w:t>
       </w:r>
       <w:r>
         <w:t xml:space="preserve"> </w:t>

</xml_diff>

<commit_message>
Demos 17 (Genie accuracy ladder) and 18 (Domains, Pages & Metrics), Day 2 2:45-3:45
D17: legacy_* starting state with data dictionary and a 10-question benchmark (truth = gold oracle);
ref_d17_* business layer; Accuracy Lab (Start/Reference) Genie agents with native benchmarks;
d17_ladder.py + score_genie.py measure the ladder (R1 5% -> R4 50% -> R5-R7 90-100%).
Live path run in the UI on a clone: 20 -> 10 -> 30 -> 50 -> 100 -> 100 % (Genie's judge, Mode: Chat).

D18: guide, reference Pages, d18_domain.sh for the Revantage workspace (FEVM is at its
governed-tag limit). Verified with a draft Page: Genie Code fills the Page form; Genie One reads
the Page but weighs it against conflicting certified views; Genie agents don't use Pages.

Decks (internal, client, modules), click-path, handout, architecture, README, RUNBOOK, preflight updated.
Scope: CLAUDE.md + scope.json allow the D18 governed tag, domain and Pages.

Co-authored-by: Isaac <no-reply@databricks.com>
</commit_message>
<xml_diff>
--- a/assets/click-path.docx
+++ b/assets/click-path.docx
@@ -28,7 +28,7 @@
         </w:p>
       </w:sdtContent>
     </w:sdt>
-    <w:bookmarkStart w:id="175" w:name="X7750fde33f3280d7bd261aefa5c2f7054d0f490"/>
+    <w:bookmarkStart w:id="196" w:name="X7750fde33f3280d7bd261aefa5c2f7054d0f490"/>
     <w:p>
       <w:pPr>
         <w:pStyle w:val="Heading1"/>
@@ -228,7 +228,7 @@
         <w:t xml:space="preserve">Architecture</w:t>
       </w:r>
     </w:p>
-    <w:bookmarkStart w:id="174" w:name="contents"/>
+    <w:bookmarkStart w:id="195" w:name="contents"/>
     <w:p>
       <w:pPr>
         <w:pStyle w:val="Heading2"/>
@@ -662,6 +662,64 @@
             <w:rStyle w:val="Hyperlink"/>
           </w:rPr>
           <w:t xml:space="preserve">“Trust scorecard”</w:t>
+        </w:r>
+      </w:hyperlink>
+    </w:p>
+    <w:p>
+      <w:pPr>
+        <w:pStyle w:val="Compact"/>
+        <w:numPr>
+          <w:ilvl w:val="0"/>
+          <w:numId w:val="1001"/>
+        </w:numPr>
+      </w:pPr>
+      <w:hyperlink w:anchor="demo-17">
+        <w:r>
+          <w:rPr>
+            <w:rStyle w:val="Hyperlink"/>
+          </w:rPr>
+          <w:t xml:space="preserve">Demo 17: Genie Accuracy Ladder —</w:t>
+        </w:r>
+        <w:r>
+          <w:rPr>
+            <w:rStyle w:val="Hyperlink"/>
+          </w:rPr>
+          <w:t xml:space="preserve"> </w:t>
+        </w:r>
+        <w:r>
+          <w:rPr>
+            <w:rStyle w:val="Hyperlink"/>
+          </w:rPr>
+          <w:t xml:space="preserve">“From 0 to 10 out of 10, one layer at a time”</w:t>
+        </w:r>
+      </w:hyperlink>
+    </w:p>
+    <w:p>
+      <w:pPr>
+        <w:pStyle w:val="Compact"/>
+        <w:numPr>
+          <w:ilvl w:val="0"/>
+          <w:numId w:val="1001"/>
+        </w:numPr>
+      </w:pPr>
+      <w:hyperlink w:anchor="demo-18">
+        <w:r>
+          <w:rPr>
+            <w:rStyle w:val="Hyperlink"/>
+          </w:rPr>
+          <w:t xml:space="preserve">Demo 18: Domains, Pages &amp; Metrics —</w:t>
+        </w:r>
+        <w:r>
+          <w:rPr>
+            <w:rStyle w:val="Hyperlink"/>
+          </w:rPr>
+          <w:t xml:space="preserve"> </w:t>
+        </w:r>
+        <w:r>
+          <w:rPr>
+            <w:rStyle w:val="Hyperlink"/>
+          </w:rPr>
+          <w:t xml:space="preserve">“Teach Genie One what your words mean”</w:t>
         </w:r>
       </w:hyperlink>
     </w:p>
@@ -20603,7 +20661,7 @@
       </w:r>
     </w:p>
     <w:bookmarkEnd w:id="172"/>
-    <w:bookmarkStart w:id="173" w:name="wrap-up-14"/>
+    <w:bookmarkStart w:id="176" w:name="wrap-up-14"/>
     <w:p>
       <w:pPr>
         <w:pStyle w:val="Heading3"/>
@@ -20743,9 +20801,3871 @@
         <w:t xml:space="preserve">table; run it in the Revantage workspace pre-flight.</w:t>
       </w:r>
     </w:p>
-    <w:bookmarkEnd w:id="173"/>
-    <w:bookmarkEnd w:id="174"/>
-    <w:bookmarkEnd w:id="175"/>
+    <w:p>
+      <w:pPr>
+        <w:pStyle w:val="FirstParagraph"/>
+      </w:pPr>
+      <w:r>
+        <w:t xml:space="preserve"> </w:t>
+      </w:r>
+      <w:r>
+        <w:t xml:space="preserve">## Demo 17: Genie Accuracy Ladder —</w:t>
+      </w:r>
+      <w:r>
+        <w:t xml:space="preserve"> </w:t>
+      </w:r>
+      <w:r>
+        <w:t xml:space="preserve">“From 0 to 10 out of 10, one layer at a time”</w:t>
+      </w:r>
+    </w:p>
+    <w:p>
+      <w:pPr>
+        <w:pStyle w:val="BodyText"/>
+      </w:pPr>
+      <w:r>
+        <w:rPr>
+          <w:b/>
+          <w:bCs/>
+        </w:rPr>
+        <w:t xml:space="preserve">Session:</w:t>
+      </w:r>
+      <w:r>
+        <w:t xml:space="preserve"> </w:t>
+      </w:r>
+      <w:r>
+        <w:t xml:space="preserve">Day 2, 2:45–3:20 (35 min) ·</w:t>
+      </w:r>
+      <w:r>
+        <w:t xml:space="preserve"> </w:t>
+      </w:r>
+      <w:r>
+        <w:rPr>
+          <w:b/>
+          <w:bCs/>
+        </w:rPr>
+        <w:t xml:space="preserve">You build:</w:t>
+      </w:r>
+      <w:r>
+        <w:t xml:space="preserve"> </w:t>
+      </w:r>
+      <w:r>
+        <w:t xml:space="preserve">a Genie Agent on the legacy warehouse, made accurate step by step (business names → column comments → table descriptions and keys → metric views → instructions), with a benchmark score after every step ·</w:t>
+      </w:r>
+      <w:r>
+        <w:t xml:space="preserve"> </w:t>
+      </w:r>
+      <w:r>
+        <w:rPr>
+          <w:b/>
+          <w:bCs/>
+        </w:rPr>
+        <w:t xml:space="preserve">Reference:</w:t>
+      </w:r>
+      <w:r>
+        <w:t xml:space="preserve"> </w:t>
+      </w:r>
+      <w:r>
+        <w:t xml:space="preserve">Genie Agent</w:t>
+      </w:r>
+      <w:r>
+        <w:t xml:space="preserve"> </w:t>
+      </w:r>
+      <w:r>
+        <w:t xml:space="preserve">“Revantage Accuracy Lab (Reference)”</w:t>
+      </w:r>
+      <w:r>
+        <w:t xml:space="preserve">, tables</w:t>
+      </w:r>
+      <w:r>
+        <w:t xml:space="preserve"> </w:t>
+      </w:r>
+      <w:r>
+        <w:rPr>
+          <w:rStyle w:val="VerbatimChar"/>
+        </w:rPr>
+        <w:t xml:space="preserve">&lt;catalog&gt;.&lt;schema&gt;.ref_d17_*</w:t>
+      </w:r>
+      <w:r>
+        <w:t xml:space="preserve"> </w:t>
+      </w:r>
+      <w:r>
+        <w:t xml:space="preserve">(source</w:t>
+      </w:r>
+      <w:r>
+        <w:t xml:space="preserve"> </w:t>
+      </w:r>
+      <w:r>
+        <w:rPr>
+          <w:rStyle w:val="VerbatimChar"/>
+        </w:rPr>
+        <w:t xml:space="preserve">code/reference/d17_business_layer.sql</w:t>
+      </w:r>
+      <w:r>
+        <w:t xml:space="preserve">), scorecard</w:t>
+      </w:r>
+      <w:r>
+        <w:t xml:space="preserve"> </w:t>
+      </w:r>
+      <w:r>
+        <w:rPr>
+          <w:rStyle w:val="VerbatimChar"/>
+        </w:rPr>
+        <w:t xml:space="preserve">ref_d17_benchmark_results</w:t>
+      </w:r>
+      <w:r>
+        <w:t xml:space="preserve"> </w:t>
+      </w:r>
+      <w:r>
+        <w:t xml:space="preserve">(</w:t>
+      </w:r>
+      <w:r>
+        <w:rPr>
+          <w:rStyle w:val="VerbatimChar"/>
+        </w:rPr>
+        <w:t xml:space="preserve">code/genie/d17_ladder.py</w:t>
+      </w:r>
+      <w:r>
+        <w:t xml:space="preserve">)</w:t>
+      </w:r>
+      <w:r>
+        <w:t xml:space="preserve"> </w:t>
+      </w:r>
+      <w:r>
+        <w:rPr>
+          <w:b/>
+          <w:bCs/>
+        </w:rPr>
+        <w:t xml:space="preserve">Starting state:</w:t>
+      </w:r>
+      <w:r>
+        <w:t xml:space="preserve"> </w:t>
+      </w:r>
+      <w:r>
+        <w:t xml:space="preserve">the</w:t>
+      </w:r>
+      <w:r>
+        <w:t xml:space="preserve"> </w:t>
+      </w:r>
+      <w:r>
+        <w:t xml:space="preserve">“legacy Snowflake warehouse”</w:t>
+      </w:r>
+      <w:r>
+        <w:t xml:space="preserve"> </w:t>
+      </w:r>
+      <w:r>
+        <w:rPr>
+          <w:rStyle w:val="VerbatimChar"/>
+        </w:rPr>
+        <w:t xml:space="preserve">legacy_prp_mstr</w:t>
+      </w:r>
+      <w:r>
+        <w:t xml:space="preserve">,</w:t>
+      </w:r>
+      <w:r>
+        <w:t xml:space="preserve"> </w:t>
+      </w:r>
+      <w:r>
+        <w:rPr>
+          <w:rStyle w:val="VerbatimChar"/>
+        </w:rPr>
+        <w:t xml:space="preserve">legacy_gl_txn</w:t>
+      </w:r>
+      <w:r>
+        <w:t xml:space="preserve">,</w:t>
+      </w:r>
+      <w:r>
+        <w:t xml:space="preserve"> </w:t>
+      </w:r>
+      <w:r>
+        <w:rPr>
+          <w:rStyle w:val="VerbatimChar"/>
+        </w:rPr>
+        <w:t xml:space="preserve">legacy_gl_acct</w:t>
+      </w:r>
+      <w:r>
+        <w:t xml:space="preserve">,</w:t>
+      </w:r>
+      <w:r>
+        <w:t xml:space="preserve"> </w:t>
+      </w:r>
+      <w:r>
+        <w:rPr>
+          <w:rStyle w:val="VerbatimChar"/>
+        </w:rPr>
+        <w:t xml:space="preserve">legacy_lse</w:t>
+      </w:r>
+      <w:r>
+        <w:t xml:space="preserve">,</w:t>
+      </w:r>
+      <w:r>
+        <w:t xml:space="preserve"> </w:t>
+      </w:r>
+      <w:r>
+        <w:rPr>
+          <w:rStyle w:val="VerbatimChar"/>
+        </w:rPr>
+        <w:t xml:space="preserve">legacy_tnt</w:t>
+      </w:r>
+      <w:r>
+        <w:t xml:space="preserve">,</w:t>
+      </w:r>
+      <w:r>
+        <w:t xml:space="preserve"> </w:t>
+      </w:r>
+      <w:r>
+        <w:rPr>
+          <w:rStyle w:val="VerbatimChar"/>
+        </w:rPr>
+        <w:t xml:space="preserve">legacy_qtr_tgt</w:t>
+      </w:r>
+      <w:r>
+        <w:t xml:space="preserve"> </w:t>
+      </w:r>
+      <w:r>
+        <w:t xml:space="preserve">(abbreviated names, coded values, no comments, no keys, lease history with old versions), its documentation</w:t>
+      </w:r>
+      <w:r>
+        <w:t xml:space="preserve"> </w:t>
+      </w:r>
+      <w:r>
+        <w:rPr>
+          <w:rStyle w:val="VerbatimChar"/>
+        </w:rPr>
+        <w:t xml:space="preserve">legacy_data_dictionary</w:t>
+      </w:r>
+      <w:r>
+        <w:t xml:space="preserve">, the benchmark</w:t>
+      </w:r>
+      <w:r>
+        <w:t xml:space="preserve"> </w:t>
+      </w:r>
+      <w:r>
+        <w:rPr>
+          <w:rStyle w:val="VerbatimChar"/>
+        </w:rPr>
+        <w:t xml:space="preserve">d17_benchmark</w:t>
+      </w:r>
+      <w:r>
+        <w:t xml:space="preserve"> </w:t>
+      </w:r>
+      <w:r>
+        <w:t xml:space="preserve">(10 questions + ground-truth SQL), and the Genie Agent</w:t>
+      </w:r>
+      <w:r>
+        <w:t xml:space="preserve"> </w:t>
+      </w:r>
+      <w:r>
+        <w:t xml:space="preserve">“Revantage Accuracy Lab (Start)”</w:t>
+      </w:r>
+      <w:r>
+        <w:t xml:space="preserve"> </w:t>
+      </w:r>
+      <w:r>
+        <w:t xml:space="preserve">(the legacy tables + the same 10 benchmark questions)</w:t>
+      </w:r>
+      <w:r>
+        <w:t xml:space="preserve"> </w:t>
+      </w:r>
+      <w:r>
+        <w:rPr>
+          <w:b/>
+          <w:bCs/>
+        </w:rPr>
+        <w:t xml:space="preserve">Where:</w:t>
+      </w:r>
+      <w:r>
+        <w:t xml:space="preserve"> </w:t>
+      </w:r>
+      <w:r>
+        <w:t xml:space="preserve">Genie Agents (Configure, Benchmarks); SQL editor with Genie Code</w:t>
+      </w:r>
+    </w:p>
+    <w:p>
+      <w:pPr>
+        <w:pStyle w:val="BodyText"/>
+      </w:pPr>
+      <w:r>
+        <w:t xml:space="preserve">The story: the data is the same at every step; only the metadata changes. Genie’s accuracy on the same 10</w:t>
+      </w:r>
+      <w:r>
+        <w:t xml:space="preserve"> </w:t>
+      </w:r>
+      <w:r>
+        <w:t xml:space="preserve">questions goes</w:t>
+      </w:r>
+      <w:r>
+        <w:t xml:space="preserve"> </w:t>
+      </w:r>
+      <w:r>
+        <w:rPr>
+          <w:b/>
+          <w:bCs/>
+        </w:rPr>
+        <w:t xml:space="preserve">20% → 10% → 30% → 50% → 100%</w:t>
+      </w:r>
+      <w:r>
+        <w:t xml:space="preserve"> </w:t>
+      </w:r>
+      <w:r>
+        <w:t xml:space="preserve">(Genie’s own benchmark judge). Each layer fixes a different kind of mistake, so the</w:t>
+      </w:r>
+      <w:r>
+        <w:t xml:space="preserve"> </w:t>
+      </w:r>
+      <w:r>
+        <w:t xml:space="preserve">order matters: names and comments say what a column</w:t>
+      </w:r>
+      <w:r>
+        <w:t xml:space="preserve"> </w:t>
+      </w:r>
+      <w:r>
+        <w:rPr>
+          <w:i/>
+          <w:iCs/>
+        </w:rPr>
+        <w:t xml:space="preserve">is</w:t>
+      </w:r>
+      <w:r>
+        <w:t xml:space="preserve">, descriptions and keys say what a row</w:t>
+      </w:r>
+      <w:r>
+        <w:t xml:space="preserve"> </w:t>
+      </w:r>
+      <w:r>
+        <w:rPr>
+          <w:i/>
+          <w:iCs/>
+        </w:rPr>
+        <w:t xml:space="preserve">is</w:t>
+      </w:r>
+      <w:r>
+        <w:t xml:space="preserve">,</w:t>
+      </w:r>
+      <w:r>
+        <w:t xml:space="preserve"> </w:t>
+      </w:r>
+      <w:r>
+        <w:t xml:space="preserve">metric views say how a KPI is</w:t>
+      </w:r>
+      <w:r>
+        <w:t xml:space="preserve"> </w:t>
+      </w:r>
+      <w:r>
+        <w:rPr>
+          <w:i/>
+          <w:iCs/>
+        </w:rPr>
+        <w:t xml:space="preserve">calculated</w:t>
+      </w:r>
+      <w:r>
+        <w:t xml:space="preserve">, instructions say what the business</w:t>
+      </w:r>
+      <w:r>
+        <w:t xml:space="preserve"> </w:t>
+      </w:r>
+      <w:r>
+        <w:rPr>
+          <w:i/>
+          <w:iCs/>
+        </w:rPr>
+        <w:t xml:space="preserve">means</w:t>
+      </w:r>
+      <w:r>
+        <w:t xml:space="preserve">.</w:t>
+      </w:r>
+    </w:p>
+    <w:p>
+      <w:pPr>
+        <w:pStyle w:val="CaptionedFigure"/>
+      </w:pPr>
+      <w:r>
+        <w:drawing>
+          <wp:inline>
+            <wp:extent cx="5334000" cy="5717381"/>
+            <wp:effectExtent b="0" l="0" r="0" t="0"/>
+            <wp:docPr descr="Benchmark history of one agent: 20% → 10% → 30% → 50% → 100% → 100% as each metadata layer is added." title="" id="174" name="Picture"/>
+            <a:graphic>
+              <a:graphicData uri="http://schemas.openxmlformats.org/drawingml/2006/picture">
+                <pic:pic>
+                  <pic:nvPicPr>
+                    <pic:cNvPr descr="../notes/agent-notes/screenshots/d17-evaluations-history.png" id="175" name="Picture"/>
+                    <pic:cNvPicPr>
+                      <a:picLocks noChangeArrowheads="1" noChangeAspect="1"/>
+                    </pic:cNvPicPr>
+                  </pic:nvPicPr>
+                  <pic:blipFill>
+                    <a:blip r:embed="rId173"/>
+                    <a:stretch>
+                      <a:fillRect/>
+                    </a:stretch>
+                  </pic:blipFill>
+                  <pic:spPr bwMode="auto">
+                    <a:xfrm>
+                      <a:off x="0" y="0"/>
+                      <a:ext cx="5334000" cy="5717381"/>
+                    </a:xfrm>
+                    <a:prstGeom prst="rect">
+                      <a:avLst/>
+                    </a:prstGeom>
+                    <a:noFill/>
+                    <a:ln w="9525">
+                      <a:noFill/>
+                      <a:headEnd/>
+                      <a:tailEnd/>
+                    </a:ln>
+                  </pic:spPr>
+                </pic:pic>
+              </a:graphicData>
+            </a:graphic>
+          </wp:inline>
+        </w:drawing>
+      </w:r>
+    </w:p>
+    <w:p>
+      <w:pPr>
+        <w:pStyle w:val="ImageCaption"/>
+      </w:pPr>
+      <w:r>
+        <w:t xml:space="preserve">Benchmark history of one agent: 20% → 10% → 30% → 50% → 100% → 100% as each metadata layer is added.</w:t>
+      </w:r>
+    </w:p>
+    <w:p>
+      <w:pPr>
+        <w:pStyle w:val="BodyText"/>
+      </w:pPr>
+      <w:r>
+        <w:rPr>
+          <w:i/>
+          <w:iCs/>
+        </w:rPr>
+        <w:t xml:space="preserve">Benchmark history of one agent: 20% → 10% → 30% → 50% → 100% → 100% as each metadata layer is added.</w:t>
+      </w:r>
+    </w:p>
+    <w:bookmarkEnd w:id="176"/>
+    <w:bookmarkStart w:id="177" w:name="Xd956d77b7a5350a71dca0f7421f51e9ead97629"/>
+    <w:p>
+      <w:pPr>
+        <w:pStyle w:val="Heading3"/>
+      </w:pPr>
+      <w:r>
+        <w:t xml:space="preserve">Stage 1: Clone and take the baseline (5 min)</w:t>
+      </w:r>
+    </w:p>
+    <w:p>
+      <w:pPr>
+        <w:pStyle w:val="FirstParagraph"/>
+      </w:pPr>
+      <w:r>
+        <w:t xml:space="preserve">Genie Agents →</w:t>
+      </w:r>
+      <w:r>
+        <w:t xml:space="preserve"> </w:t>
+      </w:r>
+      <w:r>
+        <w:rPr>
+          <w:b/>
+          <w:bCs/>
+        </w:rPr>
+        <w:t xml:space="preserve">Revantage Accuracy Lab (Start)</w:t>
+      </w:r>
+      <w:r>
+        <w:t xml:space="preserve"> </w:t>
+      </w:r>
+      <w:r>
+        <w:t xml:space="preserve">→ ⋮ →</w:t>
+      </w:r>
+      <w:r>
+        <w:t xml:space="preserve"> </w:t>
+      </w:r>
+      <w:r>
+        <w:rPr>
+          <w:b/>
+          <w:bCs/>
+        </w:rPr>
+        <w:t xml:space="preserve">Clone</w:t>
+      </w:r>
+      <w:r>
+        <w:t xml:space="preserve"> </w:t>
+      </w:r>
+      <w:r>
+        <w:t xml:space="preserve">→ name it</w:t>
+      </w:r>
+      <w:r>
+        <w:t xml:space="preserve"> </w:t>
+      </w:r>
+      <w:r>
+        <w:rPr>
+          <w:rStyle w:val="VerbatimChar"/>
+        </w:rPr>
+        <w:t xml:space="preserve">Accuracy Lab – &lt;your_name&gt;</w:t>
+      </w:r>
+      <w:r>
+        <w:t xml:space="preserve">,</w:t>
+      </w:r>
+      <w:r>
+        <w:t xml:space="preserve"> </w:t>
+      </w:r>
+      <w:r>
+        <w:rPr>
+          <w:b/>
+          <w:bCs/>
+        </w:rPr>
+        <w:t xml:space="preserve">Clone to</w:t>
+      </w:r>
+      <w:r>
+        <w:t xml:space="preserve"> </w:t>
+      </w:r>
+      <w:r>
+        <w:t xml:space="preserve">your home folder →</w:t>
+      </w:r>
+      <w:r>
+        <w:t xml:space="preserve"> </w:t>
+      </w:r>
+      <w:r>
+        <w:rPr>
+          <w:b/>
+          <w:bCs/>
+        </w:rPr>
+        <w:t xml:space="preserve">Clone</w:t>
+      </w:r>
+      <w:r>
+        <w:t xml:space="preserve">. Open the</w:t>
+      </w:r>
+      <w:r>
+        <w:t xml:space="preserve"> </w:t>
+      </w:r>
+      <w:r>
+        <w:rPr>
+          <w:b/>
+          <w:bCs/>
+        </w:rPr>
+        <w:t xml:space="preserve">Benchmark</w:t>
+      </w:r>
+      <w:r>
+        <w:t xml:space="preserve"> </w:t>
+      </w:r>
+      <w:r>
+        <w:t xml:space="preserve">tab: the 10 questions came with the clone (</w:t>
+      </w:r>
+      <w:r>
+        <w:rPr>
+          <w:b/>
+          <w:bCs/>
+        </w:rPr>
+        <w:t xml:space="preserve">Questions (10)</w:t>
+      </w:r>
+      <w:r>
+        <w:t xml:space="preserve">). Set</w:t>
+      </w:r>
+      <w:r>
+        <w:t xml:space="preserve"> </w:t>
+      </w:r>
+      <w:r>
+        <w:rPr>
+          <w:b/>
+          <w:bCs/>
+        </w:rPr>
+        <w:t xml:space="preserve">Mode: Chat</w:t>
+      </w:r>
+      <w:r>
+        <w:t xml:space="preserve"> </w:t>
+      </w:r>
+      <w:r>
+        <w:t xml:space="preserve">(single-turn SQL, about 3 minutes for 10 questions; Agent mode takes about 8; the mode resets to Agent whenever the page reloads, so check it before every run) →</w:t>
+      </w:r>
+      <w:r>
+        <w:t xml:space="preserve"> </w:t>
+      </w:r>
+      <w:r>
+        <w:rPr>
+          <w:b/>
+          <w:bCs/>
+        </w:rPr>
+        <w:t xml:space="preserve">Run all benchmarks</w:t>
+      </w:r>
+      <w:r>
+        <w:t xml:space="preserve">.</w:t>
+      </w:r>
+    </w:p>
+    <w:p>
+      <w:pPr>
+        <w:pStyle w:val="BodyText"/>
+      </w:pPr>
+      <w:r>
+        <w:rPr>
+          <w:b/>
+          <w:bCs/>
+        </w:rPr>
+        <w:t xml:space="preserve">Expected:</w:t>
+      </w:r>
+      <w:r>
+        <w:t xml:space="preserve"> </w:t>
+      </w:r>
+      <w:r>
+        <w:rPr>
+          <w:b/>
+          <w:bCs/>
+        </w:rPr>
+        <w:t xml:space="preserve">≈ 2 of 10</w:t>
+      </w:r>
+      <w:r>
+        <w:t xml:space="preserve"> </w:t>
+      </w:r>
+      <w:r>
+        <w:t xml:space="preserve">(20%). Click a question: Genie’s judge shows the assessment (</w:t>
+      </w:r>
+      <w:r>
+        <w:rPr>
+          <w:b/>
+          <w:bCs/>
+        </w:rPr>
+        <w:t xml:space="preserve">Bad</w:t>
+      </w:r>
+      <w:r>
+        <w:t xml:space="preserve"> </w:t>
+      </w:r>
+      <w:r>
+        <w:t xml:space="preserve">·</w:t>
+      </w:r>
+      <w:r>
+        <w:t xml:space="preserve"> </w:t>
+      </w:r>
+      <w:r>
+        <w:rPr>
+          <w:i/>
+          <w:iCs/>
+        </w:rPr>
+        <w:t xml:space="preserve">Extra Rows</w:t>
+      </w:r>
+      <w:r>
+        <w:t xml:space="preserve">,</w:t>
+      </w:r>
+      <w:r>
+        <w:t xml:space="preserve"> </w:t>
+      </w:r>
+      <w:r>
+        <w:rPr>
+          <w:i/>
+          <w:iCs/>
+        </w:rPr>
+        <w:t xml:space="preserve">Filter Issue</w:t>
+      </w:r>
+      <w:r>
+        <w:t xml:space="preserve">), a</w:t>
+      </w:r>
+      <w:r>
+        <w:t xml:space="preserve"> </w:t>
+      </w:r>
+      <w:r>
+        <w:rPr>
+          <w:b/>
+          <w:bCs/>
+        </w:rPr>
+        <w:t xml:space="preserve">Failure analysis</w:t>
+      </w:r>
+      <w:r>
+        <w:t xml:space="preserve"> </w:t>
+      </w:r>
+      <w:r>
+        <w:t xml:space="preserve">comparing its SQL with the ground truth, and</w:t>
+      </w:r>
+      <w:r>
+        <w:t xml:space="preserve"> </w:t>
+      </w:r>
+      <w:r>
+        <w:rPr>
+          <w:b/>
+          <w:bCs/>
+        </w:rPr>
+        <w:t xml:space="preserve">Attempt fix</w:t>
+      </w:r>
+      <w:r>
+        <w:t xml:space="preserve">. Open one failure, e.g. </w:t>
+      </w:r>
+      <w:r>
+        <w:t xml:space="preserve">“How many active leases do we have?”</w:t>
+      </w:r>
+      <w:r>
+        <w:t xml:space="preserve">: Genie guessed</w:t>
+      </w:r>
+      <w:r>
+        <w:t xml:space="preserve"> </w:t>
+      </w:r>
+      <w:r>
+        <w:rPr>
+          <w:rStyle w:val="VerbatimChar"/>
+        </w:rPr>
+        <w:t xml:space="preserve">LSE_STS_CD = 'Active'</w:t>
+      </w:r>
+      <w:r>
+        <w:t xml:space="preserve"> </w:t>
+      </w:r>
+      <w:r>
+        <w:t xml:space="preserve">and got 0 (the code is</w:t>
+      </w:r>
+      <w:r>
+        <w:t xml:space="preserve"> </w:t>
+      </w:r>
+      <w:r>
+        <w:rPr>
+          <w:rStyle w:val="VerbatimChar"/>
+        </w:rPr>
+        <w:t xml:space="preserve">A</w:t>
+      </w:r>
+      <w:r>
+        <w:t xml:space="preserve">).</w:t>
+      </w:r>
+      <w:r>
+        <w:t xml:space="preserve"> </w:t>
+      </w:r>
+      <w:r>
+        <w:t xml:space="preserve">“What was total net profit in 2026-Q2?”</w:t>
+      </w:r>
+      <w:r>
+        <w:t xml:space="preserve"> </w:t>
+      </w:r>
+      <w:r>
+        <w:t xml:space="preserve">sums the wrong thing (no idea which</w:t>
+      </w:r>
+      <w:r>
+        <w:t xml:space="preserve"> </w:t>
+      </w:r>
+      <w:r>
+        <w:rPr>
+          <w:rStyle w:val="VerbatimChar"/>
+        </w:rPr>
+        <w:t xml:space="preserve">ACCT_CLS_CD</w:t>
+      </w:r>
+      <w:r>
+        <w:t xml:space="preserve"> </w:t>
+      </w:r>
+      <w:r>
+        <w:t xml:space="preserve">is revenue).</w:t>
+      </w:r>
+      <w:r>
+        <w:t xml:space="preserve"> </w:t>
+      </w:r>
+      <w:r>
+        <w:rPr>
+          <w:b/>
+          <w:bCs/>
+        </w:rPr>
+        <w:t xml:space="preserve">Tip:</w:t>
+      </w:r>
+      <w:r>
+        <w:t xml:space="preserve"> </w:t>
+      </w:r>
+      <w:r>
+        <w:t xml:space="preserve">use a new query tab in the SQL editor for every stage below, so Genie Code doesn’t re-run the previous stage’s statements.</w:t>
+      </w:r>
+      <w:r>
+        <w:t xml:space="preserve"> </w:t>
+      </w:r>
+      <w:r>
+        <w:rPr>
+          <w:b/>
+          <w:bCs/>
+        </w:rPr>
+        <w:t xml:space="preserve">Teach:</w:t>
+      </w:r>
+      <w:r>
+        <w:t xml:space="preserve"> </w:t>
+      </w:r>
+      <w:r>
+        <w:t xml:space="preserve">a benchmark is a set of real questions with an agreed answer (ground-truth SQL). Write it</w:t>
+      </w:r>
+      <w:r>
+        <w:t xml:space="preserve"> </w:t>
+      </w:r>
+      <w:r>
+        <w:rPr>
+          <w:i/>
+          <w:iCs/>
+        </w:rPr>
+        <w:t xml:space="preserve">before</w:t>
+      </w:r>
+      <w:r>
+        <w:t xml:space="preserve"> </w:t>
+      </w:r>
+      <w:r>
+        <w:t xml:space="preserve">you tune, so every change is measured, not felt.</w:t>
+      </w:r>
+    </w:p>
+    <w:bookmarkEnd w:id="177"/>
+    <w:bookmarkStart w:id="178" w:name="stage-2-business-column-names-7-min"/>
+    <w:p>
+      <w:pPr>
+        <w:pStyle w:val="Heading3"/>
+      </w:pPr>
+      <w:r>
+        <w:t xml:space="preserve">Stage 2: Business column names (7 min)</w:t>
+      </w:r>
+    </w:p>
+    <w:p>
+      <w:pPr>
+        <w:pStyle w:val="FirstParagraph"/>
+      </w:pPr>
+      <w:r>
+        <w:rPr>
+          <w:b/>
+          <w:bCs/>
+        </w:rPr>
+        <w:t xml:space="preserve">Prompt</w:t>
+      </w:r>
+      <w:r>
+        <w:t xml:space="preserve"> </w:t>
+      </w:r>
+      <w:r>
+        <w:t xml:space="preserve">(Genie Code, SQL editor):</w:t>
+      </w:r>
+      <w:r>
+        <w:t xml:space="preserve"> </w:t>
+      </w:r>
+      <w:r>
+        <w:t xml:space="preserve">&gt; Using</w:t>
+      </w:r>
+      <w:r>
+        <w:t xml:space="preserve"> </w:t>
+      </w:r>
+      <w:r>
+        <w:t xml:space="preserve">.</w:t>
+      </w:r>
+      <w:r>
+        <w:t xml:space="preserve">.legacy_data_dictionary, create one table in</w:t>
+      </w:r>
+      <w:r>
+        <w:t xml:space="preserve"> </w:t>
+      </w:r>
+      <w:r>
+        <w:t xml:space="preserve"> </w:t>
+      </w:r>
+      <w:r>
+        <w:t xml:space="preserve">for each legacy_* table in</w:t>
+      </w:r>
+      <w:r>
+        <w:t xml:space="preserve"> </w:t>
+      </w:r>
+      <w:r>
+        <w:t xml:space="preserve">.</w:t>
+      </w:r>
+      <w:r>
+        <w:t xml:space="preserve">: name it after the dictionary’s business_name for the table (the row where column_name is NULL) and rename every column to its business_name. Keep the values unchanged and don’t add comments yet. Run it and show me the row counts.</w:t>
+      </w:r>
+    </w:p>
+    <w:p>
+      <w:pPr>
+        <w:pStyle w:val="BodyText"/>
+      </w:pPr>
+      <w:r>
+        <w:rPr>
+          <w:b/>
+          <w:bCs/>
+        </w:rPr>
+        <w:t xml:space="preserve">Expected:</w:t>
+      </w:r>
+      <w:r>
+        <w:t xml:space="preserve"> </w:t>
+      </w:r>
+      <w:r>
+        <w:t xml:space="preserve">6 tables</w:t>
+      </w:r>
+      <w:r>
+        <w:t xml:space="preserve"> </w:t>
+      </w:r>
+      <w:r>
+        <w:rPr>
+          <w:rStyle w:val="VerbatimChar"/>
+        </w:rPr>
+        <w:t xml:space="preserve">properties</w:t>
+      </w:r>
+      <w:r>
+        <w:t xml:space="preserve"> </w:t>
+      </w:r>
+      <w:r>
+        <w:t xml:space="preserve">8,</w:t>
+      </w:r>
+      <w:r>
+        <w:t xml:space="preserve"> </w:t>
+      </w:r>
+      <w:r>
+        <w:rPr>
+          <w:rStyle w:val="VerbatimChar"/>
+        </w:rPr>
+        <w:t xml:space="preserve">gl_accounts</w:t>
+      </w:r>
+      <w:r>
+        <w:t xml:space="preserve"> </w:t>
+      </w:r>
+      <w:r>
+        <w:t xml:space="preserve">15,</w:t>
+      </w:r>
+      <w:r>
+        <w:t xml:space="preserve"> </w:t>
+      </w:r>
+      <w:r>
+        <w:rPr>
+          <w:rStyle w:val="VerbatimChar"/>
+        </w:rPr>
+        <w:t xml:space="preserve">gl_transactions</w:t>
+      </w:r>
+      <w:r>
+        <w:t xml:space="preserve"> </w:t>
+      </w:r>
+      <w:r>
+        <w:t xml:space="preserve">2,681,</w:t>
+      </w:r>
+      <w:r>
+        <w:t xml:space="preserve"> </w:t>
+      </w:r>
+      <w:r>
+        <w:rPr>
+          <w:rStyle w:val="VerbatimChar"/>
+        </w:rPr>
+        <w:t xml:space="preserve">leases</w:t>
+      </w:r>
+      <w:r>
+        <w:t xml:space="preserve"> </w:t>
+      </w:r>
+      <w:r>
+        <w:t xml:space="preserve">52,</w:t>
+      </w:r>
+      <w:r>
+        <w:t xml:space="preserve"> </w:t>
+      </w:r>
+      <w:r>
+        <w:rPr>
+          <w:rStyle w:val="VerbatimChar"/>
+        </w:rPr>
+        <w:t xml:space="preserve">tenants</w:t>
+      </w:r>
+      <w:r>
+        <w:t xml:space="preserve"> </w:t>
+      </w:r>
+      <w:r>
+        <w:t xml:space="preserve">40,</w:t>
+      </w:r>
+      <w:r>
+        <w:t xml:space="preserve"> </w:t>
+      </w:r>
+      <w:r>
+        <w:rPr>
+          <w:rStyle w:val="VerbatimChar"/>
+        </w:rPr>
+        <w:t xml:space="preserve">quarterly_targets</w:t>
+      </w:r>
+      <w:r>
+        <w:t xml:space="preserve"> </w:t>
+      </w:r>
+      <w:r>
+        <w:t xml:space="preserve">96; values untouched (</w:t>
+      </w:r>
+      <w:r>
+        <w:rPr>
+          <w:rStyle w:val="VerbatimChar"/>
+        </w:rPr>
+        <w:t xml:space="preserve">account_class</w:t>
+      </w:r>
+      <w:r>
+        <w:t xml:space="preserve"> </w:t>
+      </w:r>
+      <w:r>
+        <w:t xml:space="preserve">is still</w:t>
+      </w:r>
+      <w:r>
+        <w:t xml:space="preserve"> </w:t>
+      </w:r>
+      <w:r>
+        <w:rPr>
+          <w:rStyle w:val="VerbatimChar"/>
+        </w:rPr>
+        <w:t xml:space="preserve">R</w:t>
+      </w:r>
+      <w:r>
+        <w:t xml:space="preserve">/</w:t>
+      </w:r>
+      <w:r>
+        <w:rPr>
+          <w:rStyle w:val="VerbatimChar"/>
+        </w:rPr>
+        <w:t xml:space="preserve">O</w:t>
+      </w:r>
+      <w:r>
+        <w:t xml:space="preserve">/</w:t>
+      </w:r>
+      <w:r>
+        <w:rPr>
+          <w:rStyle w:val="VerbatimChar"/>
+        </w:rPr>
+        <w:t xml:space="preserve">M</w:t>
+      </w:r>
+      <w:r>
+        <w:t xml:space="preserve">/</w:t>
+      </w:r>
+      <w:r>
+        <w:rPr>
+          <w:rStyle w:val="VerbatimChar"/>
+        </w:rPr>
+        <w:t xml:space="preserve">C</w:t>
+      </w:r>
+      <w:r>
+        <w:t xml:space="preserve">/</w:t>
+      </w:r>
+      <w:r>
+        <w:rPr>
+          <w:rStyle w:val="VerbatimChar"/>
+        </w:rPr>
+        <w:t xml:space="preserve">I</w:t>
+      </w:r>
+      <w:r>
+        <w:t xml:space="preserve">).</w:t>
+      </w:r>
+      <w:r>
+        <w:t xml:space="preserve"> </w:t>
+      </w:r>
+      <w:r>
+        <w:t xml:space="preserve">Then in your agent:</w:t>
+      </w:r>
+      <w:r>
+        <w:t xml:space="preserve"> </w:t>
+      </w:r>
+      <w:r>
+        <w:rPr>
+          <w:b/>
+          <w:bCs/>
+        </w:rPr>
+        <w:t xml:space="preserve">Configure → Data</w:t>
+      </w:r>
+      <w:r>
+        <w:t xml:space="preserve"> </w:t>
+      </w:r>
+      <w:r>
+        <w:t xml:space="preserve">→ remove the six</w:t>
+      </w:r>
+      <w:r>
+        <w:t xml:space="preserve"> </w:t>
+      </w:r>
+      <w:r>
+        <w:rPr>
+          <w:rStyle w:val="VerbatimChar"/>
+        </w:rPr>
+        <w:t xml:space="preserve">legacy_*</w:t>
+      </w:r>
+      <w:r>
+        <w:t xml:space="preserve"> </w:t>
+      </w:r>
+      <w:r>
+        <w:t xml:space="preserve">tables, add your six →</w:t>
+      </w:r>
+      <w:r>
+        <w:t xml:space="preserve"> </w:t>
+      </w:r>
+      <w:r>
+        <w:rPr>
+          <w:b/>
+          <w:bCs/>
+        </w:rPr>
+        <w:t xml:space="preserve">Benchmarks → Run all</w:t>
+      </w:r>
+      <w:r>
+        <w:t xml:space="preserve">.</w:t>
+      </w:r>
+      <w:r>
+        <w:t xml:space="preserve"> </w:t>
+      </w:r>
+      <w:r>
+        <w:rPr>
+          <w:b/>
+          <w:bCs/>
+        </w:rPr>
+        <w:t xml:space="preserve">Checkpoint:</w:t>
+      </w:r>
+      <w:r>
+        <w:t xml:space="preserve"> </w:t>
+      </w:r>
+      <w:r>
+        <w:rPr>
+          <w:b/>
+          <w:bCs/>
+        </w:rPr>
+        <w:t xml:space="preserve">≈ 1 of 10</w:t>
+      </w:r>
+      <w:r>
+        <w:t xml:space="preserve"> </w:t>
+      </w:r>
+      <w:r>
+        <w:t xml:space="preserve">(10%). Readable names alone don’t help: Genie now writes</w:t>
+      </w:r>
+      <w:r>
+        <w:t xml:space="preserve"> </w:t>
+      </w:r>
+      <w:r>
+        <w:rPr>
+          <w:rStyle w:val="VerbatimChar"/>
+        </w:rPr>
+        <w:t xml:space="preserve">account_class = 'Revenue'</w:t>
+      </w:r>
+      <w:r>
+        <w:t xml:space="preserve"> </w:t>
+      </w:r>
+      <w:r>
+        <w:t xml:space="preserve">and</w:t>
+      </w:r>
+      <w:r>
+        <w:t xml:space="preserve"> </w:t>
+      </w:r>
+      <w:r>
+        <w:rPr>
+          <w:rStyle w:val="VerbatimChar"/>
+        </w:rPr>
+        <w:t xml:space="preserve">lease_status = 'Active'</w:t>
+      </w:r>
+      <w:r>
+        <w:t xml:space="preserve">, and every filter returns 0.</w:t>
+      </w:r>
+      <w:r>
+        <w:t xml:space="preserve"> </w:t>
+      </w:r>
+      <w:r>
+        <w:rPr>
+          <w:b/>
+          <w:bCs/>
+        </w:rPr>
+        <w:t xml:space="preserve">If stuck:</w:t>
+      </w:r>
+      <w:r>
+        <w:t xml:space="preserve"> </w:t>
+      </w:r>
+      <w:r>
+        <w:t xml:space="preserve">run the</w:t>
+      </w:r>
+      <w:r>
+        <w:t xml:space="preserve"> </w:t>
+      </w:r>
+      <w:r>
+        <w:rPr>
+          <w:rStyle w:val="VerbatimChar"/>
+        </w:rPr>
+        <w:t xml:space="preserve">@rung R2</w:t>
+      </w:r>
+      <w:r>
+        <w:t xml:space="preserve"> </w:t>
+      </w:r>
+      <w:r>
+        <w:t xml:space="preserve">section of</w:t>
+      </w:r>
+      <w:r>
+        <w:t xml:space="preserve"> </w:t>
+      </w:r>
+      <w:r>
+        <w:rPr>
+          <w:rStyle w:val="VerbatimChar"/>
+        </w:rPr>
+        <w:t xml:space="preserve">code/reference/d17_business_layer.sql</w:t>
+      </w:r>
+      <w:r>
+        <w:t xml:space="preserve"> </w:t>
+      </w:r>
+      <w:r>
+        <w:t xml:space="preserve">with</w:t>
+      </w:r>
+      <w:r>
+        <w:t xml:space="preserve"> </w:t>
+      </w:r>
+      <w:r>
+        <w:rPr>
+          <w:rStyle w:val="VerbatimChar"/>
+        </w:rPr>
+        <w:t xml:space="preserve">ref_d17_</w:t>
+      </w:r>
+      <w:r>
+        <w:t xml:space="preserve"> </w:t>
+      </w:r>
+      <w:r>
+        <w:t xml:space="preserve">replaced by</w:t>
+      </w:r>
+      <w:r>
+        <w:t xml:space="preserve"> </w:t>
+      </w:r>
+      <w:r>
+        <w:rPr>
+          <w:rStyle w:val="VerbatimChar"/>
+        </w:rPr>
+        <w:t xml:space="preserve">&lt;my_schema&gt;.</w:t>
+      </w:r>
+      <w:r>
+        <w:t xml:space="preserve">.</w:t>
+      </w:r>
+    </w:p>
+    <w:bookmarkEnd w:id="178"/>
+    <w:bookmarkStart w:id="179" w:name="stage-3-column-comments-5-min"/>
+    <w:p>
+      <w:pPr>
+        <w:pStyle w:val="Heading3"/>
+      </w:pPr>
+      <w:r>
+        <w:t xml:space="preserve">Stage 3: Column comments (5 min)</w:t>
+      </w:r>
+    </w:p>
+    <w:p>
+      <w:pPr>
+        <w:pStyle w:val="FirstParagraph"/>
+      </w:pPr>
+      <w:r>
+        <w:rPr>
+          <w:b/>
+          <w:bCs/>
+        </w:rPr>
+        <w:t xml:space="preserve">Prompt</w:t>
+      </w:r>
+      <w:r>
+        <w:t xml:space="preserve"> </w:t>
+      </w:r>
+      <w:r>
+        <w:t xml:space="preserve">(Genie Code, SQL editor):</w:t>
+      </w:r>
+      <w:r>
+        <w:t xml:space="preserve"> </w:t>
+      </w:r>
+      <w:r>
+        <w:t xml:space="preserve">&gt; Add a column comment to every column of my six tables in</w:t>
+      </w:r>
+      <w:r>
+        <w:t xml:space="preserve"> </w:t>
+      </w:r>
+      <w:r>
+        <w:t xml:space="preserve">, taken from the description in</w:t>
+      </w:r>
+      <w:r>
+        <w:t xml:space="preserve"> </w:t>
+      </w:r>
+      <w:r>
+        <w:t xml:space="preserve">.</w:t>
+      </w:r>
+      <w:r>
+        <w:t xml:space="preserve">.legacy_data_dictionary (match on business_name). Run it and confirm with DESCRIBE TABLE on gl_accounts and leases.</w:t>
+      </w:r>
+    </w:p>
+    <w:p>
+      <w:pPr>
+        <w:pStyle w:val="BodyText"/>
+      </w:pPr>
+      <w:r>
+        <w:rPr>
+          <w:b/>
+          <w:bCs/>
+        </w:rPr>
+        <w:t xml:space="preserve">Expected:</w:t>
+      </w:r>
+      <w:r>
+        <w:t xml:space="preserve"> </w:t>
+      </w:r>
+      <w:r>
+        <w:rPr>
+          <w:rStyle w:val="VerbatimChar"/>
+        </w:rPr>
+        <w:t xml:space="preserve">ALTER TABLE … ALTER COLUMN … COMMENT …</w:t>
+      </w:r>
+      <w:r>
+        <w:t xml:space="preserve"> </w:t>
+      </w:r>
+      <w:r>
+        <w:t xml:space="preserve">for every column;</w:t>
+      </w:r>
+      <w:r>
+        <w:t xml:space="preserve"> </w:t>
+      </w:r>
+      <w:r>
+        <w:rPr>
+          <w:rStyle w:val="VerbatimChar"/>
+        </w:rPr>
+        <w:t xml:space="preserve">account_class</w:t>
+      </w:r>
+      <w:r>
+        <w:t xml:space="preserve"> </w:t>
+      </w:r>
+      <w:r>
+        <w:t xml:space="preserve">reads</w:t>
+      </w:r>
+      <w:r>
+        <w:t xml:space="preserve"> </w:t>
+      </w:r>
+      <w:r>
+        <w:t xml:space="preserve">“R = Revenue, O = Operating expense, M = Management fee, C = CapEx, I = Intercompany recharge”</w:t>
+      </w:r>
+      <w:r>
+        <w:t xml:space="preserve">.</w:t>
+      </w:r>
+      <w:r>
+        <w:t xml:space="preserve"> </w:t>
+      </w:r>
+      <w:r>
+        <w:rPr>
+          <w:b/>
+          <w:bCs/>
+        </w:rPr>
+        <w:t xml:space="preserve">Run all benchmarks</w:t>
+      </w:r>
+      <w:r>
+        <w:t xml:space="preserve"> </w:t>
+      </w:r>
+      <w:r>
+        <w:t xml:space="preserve">again (no need to touch the agent: it reads the comments live).</w:t>
+      </w:r>
+      <w:r>
+        <w:t xml:space="preserve"> </w:t>
+      </w:r>
+      <w:r>
+        <w:rPr>
+          <w:b/>
+          <w:bCs/>
+        </w:rPr>
+        <w:t xml:space="preserve">Checkpoint:</w:t>
+      </w:r>
+      <w:r>
+        <w:t xml:space="preserve"> </w:t>
+      </w:r>
+      <w:r>
+        <w:rPr>
+          <w:b/>
+          <w:bCs/>
+        </w:rPr>
+        <w:t xml:space="preserve">≈ 3 of 10</w:t>
+      </w:r>
+      <w:r>
+        <w:t xml:space="preserve"> </w:t>
+      </w:r>
+      <w:r>
+        <w:t xml:space="preserve">(30%). Genie decodes the codes now (CapEx and office revenue are right), but it still guesses the business rules: net profit subtracts CapEx and intercompany too (€5.59M instead of</w:t>
+      </w:r>
+      <w:r>
+        <w:t xml:space="preserve"> </w:t>
+      </w:r>
+      <w:r>
+        <w:rPr>
+          <w:b/>
+          <w:bCs/>
+        </w:rPr>
+        <w:t xml:space="preserve">€6.38M</w:t>
+      </w:r>
+      <w:r>
+        <w:t xml:space="preserve">), and</w:t>
+      </w:r>
+      <w:r>
+        <w:t xml:space="preserve"> </w:t>
+      </w:r>
+      <w:r>
+        <w:t xml:space="preserve">“active leases”</w:t>
+      </w:r>
+      <w:r>
+        <w:t xml:space="preserve"> </w:t>
+      </w:r>
+      <w:r>
+        <w:t xml:space="preserve">counts old lease versions.</w:t>
+      </w:r>
+    </w:p>
+    <w:bookmarkEnd w:id="179"/>
+    <w:bookmarkStart w:id="180" w:name="Xd0a905b80ee6dc720f331bd79516c0bca0ab735"/>
+    <w:p>
+      <w:pPr>
+        <w:pStyle w:val="Heading3"/>
+      </w:pPr>
+      <w:r>
+        <w:t xml:space="preserve">Stage 4: Table descriptions and keys (6 min)</w:t>
+      </w:r>
+    </w:p>
+    <w:p>
+      <w:pPr>
+        <w:pStyle w:val="FirstParagraph"/>
+      </w:pPr>
+      <w:r>
+        <w:rPr>
+          <w:b/>
+          <w:bCs/>
+        </w:rPr>
+        <w:t xml:space="preserve">Prompt</w:t>
+      </w:r>
+      <w:r>
+        <w:t xml:space="preserve"> </w:t>
+      </w:r>
+      <w:r>
+        <w:t xml:space="preserve">(Genie Code, SQL editor):</w:t>
+      </w:r>
+      <w:r>
+        <w:t xml:space="preserve"> </w:t>
+      </w:r>
+      <w:r>
+        <w:t xml:space="preserve">&gt; For each of my six tables in</w:t>
+      </w:r>
+      <w:r>
+        <w:t xml:space="preserve"> </w:t>
+      </w:r>
+      <w:r>
+        <w:t xml:space="preserve">, set the table comment from the legacy_data_dictionary row where column_name is NULL (use my table and column names instead of the legacy ones). Then add the primary keys and foreign keys those descriptions name; make the key columns NOT NULL first. Run it and show me the constraints.</w:t>
+      </w:r>
+    </w:p>
+    <w:p>
+      <w:pPr>
+        <w:pStyle w:val="BodyText"/>
+      </w:pPr>
+      <w:r>
+        <w:rPr>
+          <w:b/>
+          <w:bCs/>
+        </w:rPr>
+        <w:t xml:space="preserve">Expected:</w:t>
+      </w:r>
+      <w:r>
+        <w:t xml:space="preserve"> </w:t>
+      </w:r>
+      <w:r>
+        <w:rPr>
+          <w:rStyle w:val="VerbatimChar"/>
+        </w:rPr>
+        <w:t xml:space="preserve">COMMENT ON TABLE …</w:t>
+      </w:r>
+      <w:r>
+        <w:t xml:space="preserve">;</w:t>
+      </w:r>
+      <w:r>
+        <w:t xml:space="preserve"> </w:t>
+      </w:r>
+      <w:r>
+        <w:rPr>
+          <w:rStyle w:val="VerbatimChar"/>
+        </w:rPr>
+        <w:t xml:space="preserve">leases</w:t>
+      </w:r>
+      <w:r>
+        <w:t xml:space="preserve"> </w:t>
+      </w:r>
+      <w:r>
+        <w:t xml:space="preserve">says</w:t>
+      </w:r>
+      <w:r>
+        <w:t xml:space="preserve"> </w:t>
+      </w:r>
+      <w:r>
+        <w:t xml:space="preserve">“one row per lease VERSION … the current one has the latest updated_at”</w:t>
+      </w:r>
+      <w:r>
+        <w:t xml:space="preserve">; PKs on all six, FKs from</w:t>
+      </w:r>
+      <w:r>
+        <w:t xml:space="preserve"> </w:t>
+      </w:r>
+      <w:r>
+        <w:rPr>
+          <w:rStyle w:val="VerbatimChar"/>
+        </w:rPr>
+        <w:t xml:space="preserve">gl_transactions</w:t>
+      </w:r>
+      <w:r>
+        <w:t xml:space="preserve">,</w:t>
+      </w:r>
+      <w:r>
+        <w:t xml:space="preserve"> </w:t>
+      </w:r>
+      <w:r>
+        <w:rPr>
+          <w:rStyle w:val="VerbatimChar"/>
+        </w:rPr>
+        <w:t xml:space="preserve">leases</w:t>
+      </w:r>
+      <w:r>
+        <w:t xml:space="preserve">,</w:t>
+      </w:r>
+      <w:r>
+        <w:t xml:space="preserve"> </w:t>
+      </w:r>
+      <w:r>
+        <w:rPr>
+          <w:rStyle w:val="VerbatimChar"/>
+        </w:rPr>
+        <w:t xml:space="preserve">quarterly_targets</w:t>
+      </w:r>
+      <w:r>
+        <w:t xml:space="preserve">.</w:t>
+      </w:r>
+      <w:r>
+        <w:t xml:space="preserve"> </w:t>
+      </w:r>
+      <w:r>
+        <w:rPr>
+          <w:b/>
+          <w:bCs/>
+        </w:rPr>
+        <w:t xml:space="preserve">Checkpoint:</w:t>
+      </w:r>
+      <w:r>
+        <w:t xml:space="preserve"> </w:t>
+      </w:r>
+      <w:r>
+        <w:rPr>
+          <w:b/>
+          <w:bCs/>
+        </w:rPr>
+        <w:t xml:space="preserve">≈ 5 of 10</w:t>
+      </w:r>
+      <w:r>
+        <w:t xml:space="preserve"> </w:t>
+      </w:r>
+      <w:r>
+        <w:t xml:space="preserve">(50%). The lease questions pass (39 active leases, €1,083,458.87 monthly rent): the grain was the missing fact. Net profit is still wrong: no table can tell Genie the</w:t>
+      </w:r>
+      <w:r>
+        <w:t xml:space="preserve"> </w:t>
+      </w:r>
+      <w:r>
+        <w:rPr>
+          <w:i/>
+          <w:iCs/>
+        </w:rPr>
+        <w:t xml:space="preserve">Finance</w:t>
+      </w:r>
+      <w:r>
+        <w:t xml:space="preserve"> </w:t>
+      </w:r>
+      <w:r>
+        <w:t xml:space="preserve">definition.</w:t>
+      </w:r>
+      <w:r>
+        <w:t xml:space="preserve"> </w:t>
+      </w:r>
+      <w:r>
+        <w:rPr>
+          <w:b/>
+          <w:bCs/>
+        </w:rPr>
+        <w:t xml:space="preserve">Watch for:</w:t>
+      </w:r>
+      <w:r>
+        <w:t xml:space="preserve"> </w:t>
+      </w:r>
+      <w:r>
+        <w:t xml:space="preserve">recreating a table with</w:t>
+      </w:r>
+      <w:r>
+        <w:t xml:space="preserve"> </w:t>
+      </w:r>
+      <w:r>
+        <w:rPr>
+          <w:rStyle w:val="VerbatimChar"/>
+        </w:rPr>
+        <w:t xml:space="preserve">CREATE OR REPLACE TABLE … AS SELECT</w:t>
+      </w:r>
+      <w:r>
+        <w:t xml:space="preserve"> </w:t>
+      </w:r>
+      <w:r>
+        <w:t xml:space="preserve">keeps its old comments. Drop it first if you want a clean slate.</w:t>
+      </w:r>
+    </w:p>
+    <w:bookmarkEnd w:id="180"/>
+    <w:bookmarkStart w:id="181" w:name="X2fd00eca384941824642d4cdf680257929c4f3b"/>
+    <w:p>
+      <w:pPr>
+        <w:pStyle w:val="Heading3"/>
+      </w:pPr>
+      <w:r>
+        <w:t xml:space="preserve">Stage 5: Metric views and instructions (6 min)</w:t>
+      </w:r>
+    </w:p>
+    <w:p>
+      <w:pPr>
+        <w:pStyle w:val="FirstParagraph"/>
+      </w:pPr>
+      <w:r>
+        <w:rPr>
+          <w:b/>
+          <w:bCs/>
+        </w:rPr>
+        <w:t xml:space="preserve">Configure → Data → Add</w:t>
+      </w:r>
+      <w:r>
+        <w:t xml:space="preserve"> </w:t>
+      </w:r>
+      <w:r>
+        <w:t xml:space="preserve">the governed metric views</w:t>
+      </w:r>
+      <w:r>
+        <w:t xml:space="preserve"> </w:t>
+      </w:r>
+      <w:r>
+        <w:rPr>
+          <w:rStyle w:val="VerbatimChar"/>
+        </w:rPr>
+        <w:t xml:space="preserve">&lt;catalog&gt;.&lt;schema&gt;.ref_mv_net_profit_margin</w:t>
+      </w:r>
+      <w:r>
+        <w:t xml:space="preserve">,</w:t>
+      </w:r>
+      <w:r>
+        <w:t xml:space="preserve"> </w:t>
+      </w:r>
+      <w:r>
+        <w:rPr>
+          <w:rStyle w:val="VerbatimChar"/>
+        </w:rPr>
+        <w:t xml:space="preserve">ref_mv_target_attainment</w:t>
+      </w:r>
+      <w:r>
+        <w:t xml:space="preserve">,</w:t>
+      </w:r>
+      <w:r>
+        <w:t xml:space="preserve"> </w:t>
+      </w:r>
+      <w:r>
+        <w:rPr>
+          <w:rStyle w:val="VerbatimChar"/>
+        </w:rPr>
+        <w:t xml:space="preserve">ref_mv_qoq_revenue_growth</w:t>
+      </w:r>
+      <w:r>
+        <w:t xml:space="preserve"> </w:t>
+      </w:r>
+      <w:r>
+        <w:t xml:space="preserve">(or your own from Demo 7) →</w:t>
+      </w:r>
+      <w:r>
+        <w:t xml:space="preserve"> </w:t>
+      </w:r>
+      <w:r>
+        <w:rPr>
+          <w:b/>
+          <w:bCs/>
+        </w:rPr>
+        <w:t xml:space="preserve">Run all</w:t>
+      </w:r>
+      <w:r>
+        <w:t xml:space="preserve">.</w:t>
+      </w:r>
+      <w:r>
+        <w:t xml:space="preserve"> </w:t>
+      </w:r>
+      <w:r>
+        <w:rPr>
+          <w:b/>
+          <w:bCs/>
+        </w:rPr>
+        <w:t xml:space="preserve">Checkpoint:</w:t>
+      </w:r>
+      <w:r>
+        <w:t xml:space="preserve"> </w:t>
+      </w:r>
+      <w:r>
+        <w:rPr>
+          <w:b/>
+          <w:bCs/>
+        </w:rPr>
+        <w:t xml:space="preserve">9–10 of 10</w:t>
+      </w:r>
+      <w:r>
+        <w:t xml:space="preserve">. Net profit, margin, target misses and attainment now come from the approved definitions (€6.38M, 59.3%, Peachtree Center / Harbor Tower / Zuidas Residences, 62.5%).</w:t>
+      </w:r>
+      <w:r>
+        <w:t xml:space="preserve"> </w:t>
+      </w:r>
+      <w:r>
+        <w:t xml:space="preserve">Then</w:t>
+      </w:r>
+      <w:r>
+        <w:t xml:space="preserve"> </w:t>
+      </w:r>
+      <w:r>
+        <w:rPr>
+          <w:b/>
+          <w:bCs/>
+        </w:rPr>
+        <w:t xml:space="preserve">Configure → Instructions</w:t>
+      </w:r>
+      <w:r>
+        <w:t xml:space="preserve"> </w:t>
+      </w:r>
+      <w:r>
+        <w:t xml:space="preserve">→ paste:</w:t>
+      </w:r>
+      <w:r>
+        <w:t xml:space="preserve"> </w:t>
+      </w:r>
+      <w:r>
+        <w:t xml:space="preserve">&gt; Amounts are EUR. The latest complete fiscal quarter is 2026-Q2:</w:t>
+      </w:r>
+      <w:r>
+        <w:t xml:space="preserve"> </w:t>
+      </w:r>
+      <w:r>
+        <w:t xml:space="preserve">“this quarter”</w:t>
+      </w:r>
+      <w:r>
+        <w:t xml:space="preserve"> </w:t>
+      </w:r>
+      <w:r>
+        <w:t xml:space="preserve">means 2026-Q2 and</w:t>
+      </w:r>
+      <w:r>
+        <w:t xml:space="preserve"> </w:t>
+      </w:r>
+      <w:r>
+        <w:t xml:space="preserve">“last quarter”</w:t>
+      </w:r>
+      <w:r>
+        <w:t xml:space="preserve"> </w:t>
+      </w:r>
+      <w:r>
+        <w:t xml:space="preserve">means 2026-Q1; never use the calendar date to pick a quarter. Net profit = revenue (account_class R) - operating expense (O) - management fee (M); CapEx (C) and intercompany (I) are not deducted; prefer the metric views for net profit, margin and target attainment. The leases table keeps every version of a lease: always use only the latest version per lease_id before counting or summing; active means lease_status =</w:t>
+      </w:r>
+      <w:r>
+        <w:t xml:space="preserve"> </w:t>
+      </w:r>
+      <w:r>
+        <w:t xml:space="preserve">‘A’</w:t>
+      </w:r>
+      <w:r>
+        <w:t xml:space="preserve">. Property type codes: OFF = Office, MFH = Multifamily, RTL = Retail. Credit ratings best to worst: AAA, AA, A, BBB, BB, B; below investment grade means BB or B.</w:t>
+      </w:r>
+    </w:p>
+    <w:p>
+      <w:pPr>
+        <w:pStyle w:val="BodyText"/>
+      </w:pPr>
+      <w:r>
+        <w:rPr>
+          <w:b/>
+          <w:bCs/>
+        </w:rPr>
+        <w:t xml:space="preserve">Checkpoint:</w:t>
+      </w:r>
+      <w:r>
+        <w:t xml:space="preserve"> </w:t>
+      </w:r>
+      <w:r>
+        <w:rPr>
+          <w:b/>
+          <w:bCs/>
+        </w:rPr>
+        <w:t xml:space="preserve">10 of 10</w:t>
+      </w:r>
+      <w:r>
+        <w:t xml:space="preserve">, and it stays there when the question is phrased differently (the instructions carry the conventions the data can’t).</w:t>
+      </w:r>
+      <w:r>
+        <w:t xml:space="preserve"> </w:t>
+      </w:r>
+      <w:r>
+        <w:rPr>
+          <w:b/>
+          <w:bCs/>
+        </w:rPr>
+        <w:t xml:space="preserve">Teach:</w:t>
+      </w:r>
+      <w:r>
+        <w:t xml:space="preserve"> </w:t>
+      </w:r>
+      <w:r>
+        <w:t xml:space="preserve">instructions are for business conventions that live nowhere in the data (</w:t>
+      </w:r>
+      <w:r>
+        <w:t xml:space="preserve">“this quarter”</w:t>
+      </w:r>
+      <w:r>
+        <w:t xml:space="preserve">,</w:t>
+      </w:r>
+      <w:r>
+        <w:t xml:space="preserve"> </w:t>
+      </w:r>
+      <w:r>
+        <w:t xml:space="preserve">“below investment grade”</w:t>
+      </w:r>
+      <w:r>
+        <w:t xml:space="preserve">). Keep them short; everything a column or table can say belongs in the catalog, where every tool (dashboards, Genie One, Genie Code) gets it too.</w:t>
+      </w:r>
+    </w:p>
+    <w:bookmarkEnd w:id="181"/>
+    <w:bookmarkStart w:id="182" w:name="stage-6-keep-it-accurate-6-min"/>
+    <w:p>
+      <w:pPr>
+        <w:pStyle w:val="Heading3"/>
+      </w:pPr>
+      <w:r>
+        <w:t xml:space="preserve">Stage 6: Keep it accurate (6 min)</w:t>
+      </w:r>
+    </w:p>
+    <w:p>
+      <w:pPr>
+        <w:pStyle w:val="Compact"/>
+        <w:numPr>
+          <w:ilvl w:val="0"/>
+          <w:numId w:val="1030"/>
+        </w:numPr>
+      </w:pPr>
+      <w:r>
+        <w:rPr>
+          <w:b/>
+          <w:bCs/>
+        </w:rPr>
+        <w:t xml:space="preserve">Benchmark → Evaluations:</w:t>
+      </w:r>
+      <w:r>
+        <w:t xml:space="preserve"> </w:t>
+      </w:r>
+      <w:r>
+        <w:t xml:space="preserve">every run is kept with its accuracy; open a run to see each question’s SQL next to the ground truth, the failure analysis, and</w:t>
+      </w:r>
+      <w:r>
+        <w:t xml:space="preserve"> </w:t>
+      </w:r>
+      <w:r>
+        <w:rPr>
+          <w:b/>
+          <w:bCs/>
+        </w:rPr>
+        <w:t xml:space="preserve">Attempt fix</w:t>
+      </w:r>
+      <w:r>
+        <w:t xml:space="preserve"> </w:t>
+      </w:r>
+      <w:r>
+        <w:t xml:space="preserve">(Genie proposes the instruction or example that would fix it).</w:t>
+      </w:r>
+      <w:r>
+        <w:t xml:space="preserve"> </w:t>
+      </w:r>
+      <w:r>
+        <w:rPr>
+          <w:b/>
+          <w:bCs/>
+        </w:rPr>
+        <w:t xml:space="preserve">Analyze with Genie</w:t>
+      </w:r>
+      <w:r>
+        <w:t xml:space="preserve"> </w:t>
+      </w:r>
+      <w:r>
+        <w:t xml:space="preserve">summarizes the context gaps across a run. Re-run after every schema or instruction change.</w:t>
+      </w:r>
+    </w:p>
+    <w:p>
+      <w:pPr>
+        <w:pStyle w:val="Compact"/>
+        <w:numPr>
+          <w:ilvl w:val="0"/>
+          <w:numId w:val="1030"/>
+        </w:numPr>
+      </w:pPr>
+      <w:r>
+        <w:rPr>
+          <w:b/>
+          <w:bCs/>
+        </w:rPr>
+        <w:t xml:space="preserve">Monitoring</w:t>
+      </w:r>
+      <w:r>
+        <w:t xml:space="preserve"> </w:t>
+      </w:r>
+      <w:r>
+        <w:t xml:space="preserve">tab: the questions people actually ask, thumbs up/down, and the answers to review. Turn a good answer into an</w:t>
+      </w:r>
+      <w:r>
+        <w:t xml:space="preserve"> </w:t>
+      </w:r>
+      <w:r>
+        <w:rPr>
+          <w:b/>
+          <w:bCs/>
+        </w:rPr>
+        <w:t xml:space="preserve">SQL example</w:t>
+      </w:r>
+      <w:r>
+        <w:t xml:space="preserve">; turn a recurring question into a new</w:t>
+      </w:r>
+      <w:r>
+        <w:t xml:space="preserve"> </w:t>
+      </w:r>
+      <w:r>
+        <w:rPr>
+          <w:b/>
+          <w:bCs/>
+        </w:rPr>
+        <w:t xml:space="preserve">benchmark</w:t>
+      </w:r>
+      <w:r>
+        <w:t xml:space="preserve"> </w:t>
+      </w:r>
+      <w:r>
+        <w:t xml:space="preserve">question.</w:t>
+      </w:r>
+    </w:p>
+    <w:p>
+      <w:pPr>
+        <w:pStyle w:val="Compact"/>
+        <w:numPr>
+          <w:ilvl w:val="0"/>
+          <w:numId w:val="1030"/>
+        </w:numPr>
+      </w:pPr>
+      <w:r>
+        <w:rPr>
+          <w:b/>
+          <w:bCs/>
+        </w:rPr>
+        <w:t xml:space="preserve">SQL examples, synonyms, join relationships</w:t>
+      </w:r>
+      <w:r>
+        <w:t xml:space="preserve"> </w:t>
+      </w:r>
+      <w:r>
+        <w:t xml:space="preserve">(the Reference agent has 3 examples, synonyms on 7 columns, 5 joins): they make answers stable across phrasings; the score stays at 10/10, the variance drops.</w:t>
+      </w:r>
+    </w:p>
+    <w:p>
+      <w:pPr>
+        <w:pStyle w:val="Compact"/>
+        <w:numPr>
+          <w:ilvl w:val="0"/>
+          <w:numId w:val="1030"/>
+        </w:numPr>
+      </w:pPr>
+      <w:r>
+        <w:t xml:space="preserve">The facilitator’s scorecard, measured with the same 10 questions twice per rung:</w:t>
+      </w:r>
+    </w:p>
+    <w:p>
+      <w:pPr>
+        <w:pStyle w:val="SourceCode"/>
+      </w:pPr>
+      <w:r>
+        <w:rPr>
+          <w:rStyle w:val="KeywordTok"/>
+        </w:rPr>
+        <w:t xml:space="preserve">SELECT</w:t>
+      </w:r>
+      <w:r>
+        <w:rPr>
+          <w:rStyle w:val="NormalTok"/>
+        </w:rPr>
+        <w:t xml:space="preserve"> rung, </w:t>
+      </w:r>
+      <w:r>
+        <w:rPr>
+          <w:rStyle w:val="FunctionTok"/>
+        </w:rPr>
+        <w:t xml:space="preserve">ROUND</w:t>
+      </w:r>
+      <w:r>
+        <w:rPr>
+          <w:rStyle w:val="NormalTok"/>
+        </w:rPr>
+        <w:t xml:space="preserve">(</w:t>
+      </w:r>
+      <w:r>
+        <w:rPr>
+          <w:rStyle w:val="DecValTok"/>
+        </w:rPr>
+        <w:t xml:space="preserve">100</w:t>
+      </w:r>
+      <w:r>
+        <w:rPr>
+          <w:rStyle w:val="NormalTok"/>
+        </w:rPr>
+        <w:t xml:space="preserve"> </w:t>
+      </w:r>
+      <w:r>
+        <w:rPr>
+          <w:rStyle w:val="OperatorTok"/>
+        </w:rPr>
+        <w:t xml:space="preserve">*</w:t>
+      </w:r>
+      <w:r>
+        <w:rPr>
+          <w:rStyle w:val="NormalTok"/>
+        </w:rPr>
+        <w:t xml:space="preserve"> </w:t>
+      </w:r>
+      <w:r>
+        <w:rPr>
+          <w:rStyle w:val="FunctionTok"/>
+        </w:rPr>
+        <w:t xml:space="preserve">AVG</w:t>
+      </w:r>
+      <w:r>
+        <w:rPr>
+          <w:rStyle w:val="NormalTok"/>
+        </w:rPr>
+        <w:t xml:space="preserve">(</w:t>
+      </w:r>
+      <w:r>
+        <w:rPr>
+          <w:rStyle w:val="FunctionTok"/>
+        </w:rPr>
+        <w:t xml:space="preserve">CAST</w:t>
+      </w:r>
+      <w:r>
+        <w:rPr>
+          <w:rStyle w:val="NormalTok"/>
+        </w:rPr>
+        <w:t xml:space="preserve">(correct </w:t>
+      </w:r>
+      <w:r>
+        <w:rPr>
+          <w:rStyle w:val="KeywordTok"/>
+        </w:rPr>
+        <w:t xml:space="preserve">AS</w:t>
+      </w:r>
+      <w:r>
+        <w:rPr>
+          <w:rStyle w:val="NormalTok"/>
+        </w:rPr>
+        <w:t xml:space="preserve"> </w:t>
+      </w:r>
+      <w:r>
+        <w:rPr>
+          <w:rStyle w:val="DataTypeTok"/>
+        </w:rPr>
+        <w:t xml:space="preserve">INT</w:t>
+      </w:r>
+      <w:r>
+        <w:rPr>
+          <w:rStyle w:val="NormalTok"/>
+        </w:rPr>
+        <w:t xml:space="preserve">))) </w:t>
+      </w:r>
+      <w:r>
+        <w:rPr>
+          <w:rStyle w:val="KeywordTok"/>
+        </w:rPr>
+        <w:t xml:space="preserve">AS</w:t>
+      </w:r>
+      <w:r>
+        <w:rPr>
+          <w:rStyle w:val="NormalTok"/>
+        </w:rPr>
+        <w:t xml:space="preserve"> pct_correct</w:t>
+      </w:r>
+      <w:r>
+        <w:br/>
+      </w:r>
+      <w:r>
+        <w:rPr>
+          <w:rStyle w:val="KeywordTok"/>
+        </w:rPr>
+        <w:t xml:space="preserve">FROM</w:t>
+      </w:r>
+      <w:r>
+        <w:rPr>
+          <w:rStyle w:val="NormalTok"/>
+        </w:rPr>
+        <w:t xml:space="preserve"> </w:t>
+      </w:r>
+      <w:r>
+        <w:rPr>
+          <w:rStyle w:val="OperatorTok"/>
+        </w:rPr>
+        <w:t xml:space="preserve">&lt;</w:t>
+      </w:r>
+      <w:r>
+        <w:rPr>
+          <w:rStyle w:val="NormalTok"/>
+        </w:rPr>
+        <w:t xml:space="preserve">catalog</w:t>
+      </w:r>
+      <w:r>
+        <w:rPr>
+          <w:rStyle w:val="OperatorTok"/>
+        </w:rPr>
+        <w:t xml:space="preserve">&gt;</w:t>
+      </w:r>
+      <w:r>
+        <w:rPr>
+          <w:rStyle w:val="NormalTok"/>
+        </w:rPr>
+        <w:t xml:space="preserve">.</w:t>
+      </w:r>
+      <w:r>
+        <w:rPr>
+          <w:rStyle w:val="OperatorTok"/>
+        </w:rPr>
+        <w:t xml:space="preserve">&lt;</w:t>
+      </w:r>
+      <w:r>
+        <w:rPr>
+          <w:rStyle w:val="KeywordTok"/>
+        </w:rPr>
+        <w:t xml:space="preserve">schema</w:t>
+      </w:r>
+      <w:r>
+        <w:rPr>
+          <w:rStyle w:val="OperatorTok"/>
+        </w:rPr>
+        <w:t xml:space="preserve">&gt;</w:t>
+      </w:r>
+      <w:r>
+        <w:rPr>
+          <w:rStyle w:val="NormalTok"/>
+        </w:rPr>
+        <w:t xml:space="preserve">.ref_d17_benchmark_results</w:t>
+      </w:r>
+      <w:r>
+        <w:br/>
+      </w:r>
+      <w:r>
+        <w:rPr>
+          <w:rStyle w:val="KeywordTok"/>
+        </w:rPr>
+        <w:t xml:space="preserve">GROUP</w:t>
+      </w:r>
+      <w:r>
+        <w:rPr>
+          <w:rStyle w:val="NormalTok"/>
+        </w:rPr>
+        <w:t xml:space="preserve"> </w:t>
+      </w:r>
+      <w:r>
+        <w:rPr>
+          <w:rStyle w:val="KeywordTok"/>
+        </w:rPr>
+        <w:t xml:space="preserve">BY</w:t>
+      </w:r>
+      <w:r>
+        <w:rPr>
+          <w:rStyle w:val="NormalTok"/>
+        </w:rPr>
+        <w:t xml:space="preserve"> rung </w:t>
+      </w:r>
+      <w:r>
+        <w:rPr>
+          <w:rStyle w:val="KeywordTok"/>
+        </w:rPr>
+        <w:t xml:space="preserve">ORDER</w:t>
+      </w:r>
+      <w:r>
+        <w:rPr>
+          <w:rStyle w:val="NormalTok"/>
+        </w:rPr>
+        <w:t xml:space="preserve"> </w:t>
+      </w:r>
+      <w:r>
+        <w:rPr>
+          <w:rStyle w:val="KeywordTok"/>
+        </w:rPr>
+        <w:t xml:space="preserve">BY</w:t>
+      </w:r>
+      <w:r>
+        <w:rPr>
+          <w:rStyle w:val="NormalTok"/>
+        </w:rPr>
+        <w:t xml:space="preserve"> rung</w:t>
+      </w:r>
+    </w:p>
+    <w:p>
+      <w:pPr>
+        <w:pStyle w:val="FirstParagraph"/>
+      </w:pPr>
+      <w:r>
+        <w:t xml:space="preserve">→ R1</w:t>
+      </w:r>
+      <w:r>
+        <w:t xml:space="preserve"> </w:t>
+      </w:r>
+      <w:r>
+        <w:rPr>
+          <w:b/>
+          <w:bCs/>
+        </w:rPr>
+        <w:t xml:space="preserve">5</w:t>
+      </w:r>
+      <w:r>
+        <w:t xml:space="preserve"> </w:t>
+      </w:r>
+      <w:r>
+        <w:t xml:space="preserve">· R2</w:t>
+      </w:r>
+      <w:r>
+        <w:t xml:space="preserve"> </w:t>
+      </w:r>
+      <w:r>
+        <w:rPr>
+          <w:b/>
+          <w:bCs/>
+        </w:rPr>
+        <w:t xml:space="preserve">10</w:t>
+      </w:r>
+      <w:r>
+        <w:t xml:space="preserve"> </w:t>
+      </w:r>
+      <w:r>
+        <w:t xml:space="preserve">· R3</w:t>
+      </w:r>
+      <w:r>
+        <w:t xml:space="preserve"> </w:t>
+      </w:r>
+      <w:r>
+        <w:rPr>
+          <w:b/>
+          <w:bCs/>
+        </w:rPr>
+        <w:t xml:space="preserve">20</w:t>
+      </w:r>
+      <w:r>
+        <w:t xml:space="preserve"> </w:t>
+      </w:r>
+      <w:r>
+        <w:t xml:space="preserve">· R4</w:t>
+      </w:r>
+      <w:r>
+        <w:t xml:space="preserve"> </w:t>
+      </w:r>
+      <w:r>
+        <w:rPr>
+          <w:b/>
+          <w:bCs/>
+        </w:rPr>
+        <w:t xml:space="preserve">50</w:t>
+      </w:r>
+      <w:r>
+        <w:t xml:space="preserve"> </w:t>
+      </w:r>
+      <w:r>
+        <w:t xml:space="preserve">· R5</w:t>
+      </w:r>
+      <w:r>
+        <w:t xml:space="preserve"> </w:t>
+      </w:r>
+      <w:r>
+        <w:rPr>
+          <w:b/>
+          <w:bCs/>
+        </w:rPr>
+        <w:t xml:space="preserve">90</w:t>
+      </w:r>
+      <w:r>
+        <w:t xml:space="preserve"> </w:t>
+      </w:r>
+      <w:r>
+        <w:t xml:space="preserve">· R6</w:t>
+      </w:r>
+      <w:r>
+        <w:t xml:space="preserve"> </w:t>
+      </w:r>
+      <w:r>
+        <w:rPr>
+          <w:b/>
+          <w:bCs/>
+        </w:rPr>
+        <w:t xml:space="preserve">100</w:t>
+      </w:r>
+      <w:r>
+        <w:t xml:space="preserve"> </w:t>
+      </w:r>
+      <w:r>
+        <w:t xml:space="preserve">· R7</w:t>
+      </w:r>
+      <w:r>
+        <w:t xml:space="preserve"> </w:t>
+      </w:r>
+      <w:r>
+        <w:rPr>
+          <w:b/>
+          <w:bCs/>
+        </w:rPr>
+        <w:t xml:space="preserve">100</w:t>
+      </w:r>
+      <w:r>
+        <w:t xml:space="preserve">.</w:t>
+      </w:r>
+    </w:p>
+    <w:bookmarkEnd w:id="182"/>
+    <w:bookmarkStart w:id="183" w:name="reset-facilitator-after-the-session-1"/>
+    <w:p>
+      <w:pPr>
+        <w:pStyle w:val="Heading3"/>
+      </w:pPr>
+      <w:r>
+        <w:t xml:space="preserve">7. Reset (facilitator, after the session)</w:t>
+      </w:r>
+    </w:p>
+    <w:p>
+      <w:pPr>
+        <w:pStyle w:val="FirstParagraph"/>
+      </w:pPr>
+      <w:r>
+        <w:t xml:space="preserve">Participants’ tables live in their own</w:t>
+      </w:r>
+      <w:r>
+        <w:t xml:space="preserve"> </w:t>
+      </w:r>
+      <w:r>
+        <w:rPr>
+          <w:rStyle w:val="VerbatimChar"/>
+        </w:rPr>
+        <w:t xml:space="preserve">&lt;my_schema&gt;</w:t>
+      </w:r>
+      <w:r>
+        <w:t xml:space="preserve">; their cloned agents in their own folders. Nothing shared changes. To rebuild the reference:</w:t>
+      </w:r>
+      <w:r>
+        <w:t xml:space="preserve"> </w:t>
+      </w:r>
+      <w:r>
+        <w:rPr>
+          <w:rStyle w:val="VerbatimChar"/>
+        </w:rPr>
+        <w:t xml:space="preserve">databricks bundle run ref_analytics</w:t>
+      </w:r>
+      <w:r>
+        <w:t xml:space="preserve">; to re-measure the ladder:</w:t>
+      </w:r>
+      <w:r>
+        <w:t xml:space="preserve"> </w:t>
+      </w:r>
+      <w:r>
+        <w:rPr>
+          <w:rStyle w:val="VerbatimChar"/>
+        </w:rPr>
+        <w:t xml:space="preserve">code/genie/d17_ladder.py</w:t>
+      </w:r>
+      <w:r>
+        <w:t xml:space="preserve">.</w:t>
+      </w:r>
+    </w:p>
+    <w:bookmarkEnd w:id="183"/>
+    <w:bookmarkStart w:id="187" w:name="wrap-up-15"/>
+    <w:p>
+      <w:pPr>
+        <w:pStyle w:val="Heading3"/>
+      </w:pPr>
+      <w:r>
+        <w:t xml:space="preserve">Wrap-up</w:t>
+      </w:r>
+    </w:p>
+    <w:p>
+      <w:pPr>
+        <w:pStyle w:val="Compact"/>
+        <w:numPr>
+          <w:ilvl w:val="0"/>
+          <w:numId w:val="1031"/>
+        </w:numPr>
+      </w:pPr>
+      <w:r>
+        <w:rPr>
+          <w:b/>
+          <w:bCs/>
+        </w:rPr>
+        <w:t xml:space="preserve">So what:</w:t>
+      </w:r>
+      <w:r>
+        <w:t xml:space="preserve"> </w:t>
+      </w:r>
+      <w:r>
+        <w:t xml:space="preserve">Genie accuracy is engineered, not prompted. Most of the gain comes from metadata in Unity Catalog (comments, descriptions, keys, metric views), which every other tool reuses; the agent’s own instructions are the last few points.</w:t>
+      </w:r>
+    </w:p>
+    <w:p>
+      <w:pPr>
+        <w:pStyle w:val="Compact"/>
+        <w:numPr>
+          <w:ilvl w:val="0"/>
+          <w:numId w:val="1031"/>
+        </w:numPr>
+      </w:pPr>
+      <w:r>
+        <w:rPr>
+          <w:b/>
+          <w:bCs/>
+        </w:rPr>
+        <w:t xml:space="preserve">Snowflake equivalent:</w:t>
+      </w:r>
+      <w:r>
+        <w:t xml:space="preserve"> </w:t>
+      </w:r>
+      <w:r>
+        <w:t xml:space="preserve">column comments and semantic views exist in Snowflake too; here they feed Genie, Genie One, Genie Code and AI/BI from one catalog, and the benchmark makes the improvement measurable.</w:t>
+      </w:r>
+    </w:p>
+    <w:p>
+      <w:pPr>
+        <w:pStyle w:val="Compact"/>
+        <w:numPr>
+          <w:ilvl w:val="0"/>
+          <w:numId w:val="1031"/>
+        </w:numPr>
+      </w:pPr>
+      <w:r>
+        <w:rPr>
+          <w:b/>
+          <w:bCs/>
+        </w:rPr>
+        <w:t xml:space="preserve">Verified in the UI:</w:t>
+      </w:r>
+      <w:r>
+        <w:t xml:space="preserve"> </w:t>
+      </w:r>
+      <w:r>
+        <w:t xml:space="preserve">2026-10-10 on the FEVM workspace, the live path end to end on a clone of the Start agent: Clone (with</w:t>
+      </w:r>
+      <w:r>
+        <w:t xml:space="preserve"> </w:t>
+      </w:r>
+      <w:r>
+        <w:rPr>
+          <w:b/>
+          <w:bCs/>
+        </w:rPr>
+        <w:t xml:space="preserve">Clone to</w:t>
+      </w:r>
+      <w:r>
+        <w:t xml:space="preserve"> </w:t>
+      </w:r>
+      <w:r>
+        <w:t xml:space="preserve">folder) kept the 10 questions; Stage 1 benchmark 20% (Agent mode); Stage 2 Genie Code prompt built the six tables (15 · 2,681 · 52 · 8 · 96 · 40 rows) → 10% (Chat); Stage 3 prompt commented all 33 columns → 30%; Stage 4 prompt set 6 descriptions, 6 PKs, 5 FKs → 50%; metric views → 100%; instructions → 100% (screenshots</w:t>
+      </w:r>
+      <w:r>
+        <w:t xml:space="preserve"> </w:t>
+      </w:r>
+      <w:r>
+        <w:rPr>
+          <w:rStyle w:val="VerbatimChar"/>
+        </w:rPr>
+        <w:t xml:space="preserve">d17-*.png</w:t>
+      </w:r>
+      <w:r>
+        <w:t xml:space="preserve">).</w:t>
+      </w:r>
+    </w:p>
+    <w:p>
+      <w:pPr>
+        <w:pStyle w:val="Compact"/>
+        <w:numPr>
+          <w:ilvl w:val="0"/>
+          <w:numId w:val="1031"/>
+        </w:numPr>
+      </w:pPr>
+      <w:r>
+        <w:rPr>
+          <w:b/>
+          <w:bCs/>
+        </w:rPr>
+        <w:t xml:space="preserve">Verified by script:</w:t>
+      </w:r>
+      <w:r>
+        <w:t xml:space="preserve"> </w:t>
+      </w:r>
+      <w:r>
+        <w:t xml:space="preserve">2026-10-10 on the FEVM workspace with</w:t>
+      </w:r>
+      <w:r>
+        <w:t xml:space="preserve"> </w:t>
+      </w:r>
+      <w:r>
+        <w:rPr>
+          <w:rStyle w:val="VerbatimChar"/>
+        </w:rPr>
+        <w:t xml:space="preserve">code/genie/d17_ladder.py</w:t>
+      </w:r>
+      <w:r>
+        <w:t xml:space="preserve"> </w:t>
+      </w:r>
+      <w:r>
+        <w:t xml:space="preserve">(a fresh agent per rung, 10 questions × 2 runs, results in</w:t>
+      </w:r>
+      <w:r>
+        <w:t xml:space="preserve"> </w:t>
+      </w:r>
+      <w:r>
+        <w:rPr>
+          <w:rStyle w:val="VerbatimChar"/>
+        </w:rPr>
+        <w:t xml:space="preserve">ref_d17_benchmark_results</w:t>
+      </w:r>
+      <w:r>
+        <w:t xml:space="preserve">): R1 1/20, R2 2/20, R3 4/20, R4 10/20, R5 18/20, R6 20/20, R7 20/20. In-place check: one agent on business names scored 1/20, then 10/20 after comments, descriptions and keys were added to its tables (no re-config needed). Deployed agents: Start 0/10, Reference 10/10.</w:t>
+      </w:r>
+    </w:p>
+    <w:p>
+      <w:pPr>
+        <w:pStyle w:val="FirstParagraph"/>
+      </w:pPr>
+      <w:r>
+        <w:t xml:space="preserve"> </w:t>
+      </w:r>
+      <w:r>
+        <w:t xml:space="preserve">## Demo 18: Domains, Pages &amp; Metrics —</w:t>
+      </w:r>
+      <w:r>
+        <w:t xml:space="preserve"> </w:t>
+      </w:r>
+      <w:r>
+        <w:t xml:space="preserve">“Teach Genie One what your words mean”</w:t>
+      </w:r>
+    </w:p>
+    <w:p>
+      <w:pPr>
+        <w:pStyle w:val="BodyText"/>
+      </w:pPr>
+      <w:r>
+        <w:rPr>
+          <w:b/>
+          <w:bCs/>
+        </w:rPr>
+        <w:t xml:space="preserve">Session:</w:t>
+      </w:r>
+      <w:r>
+        <w:t xml:space="preserve"> </w:t>
+      </w:r>
+      <w:r>
+        <w:t xml:space="preserve">Day 2, 3:20–3:45 (25 min) ·</w:t>
+      </w:r>
+      <w:r>
+        <w:t xml:space="preserve"> </w:t>
+      </w:r>
+      <w:r>
+        <w:rPr>
+          <w:b/>
+          <w:bCs/>
+        </w:rPr>
+        <w:t xml:space="preserve">You build:</w:t>
+      </w:r>
+      <w:r>
+        <w:t xml:space="preserve"> </w:t>
+      </w:r>
+      <w:r>
+        <w:t xml:space="preserve">a Page (business definition) in the Revantage domain, linked to its governed metric view, and check that Genie One uses it ·</w:t>
+      </w:r>
+      <w:r>
+        <w:t xml:space="preserve"> </w:t>
+      </w:r>
+      <w:r>
+        <w:rPr>
+          <w:b/>
+          <w:bCs/>
+        </w:rPr>
+        <w:t xml:space="preserve">Reference:</w:t>
+      </w:r>
+      <w:r>
+        <w:t xml:space="preserve"> </w:t>
+      </w:r>
+      <w:r>
+        <w:t xml:space="preserve">the four Pages in</w:t>
+      </w:r>
+      <w:r>
+        <w:t xml:space="preserve"> </w:t>
+      </w:r>
+      <w:r>
+        <w:rPr>
+          <w:rStyle w:val="VerbatimChar"/>
+        </w:rPr>
+        <w:t xml:space="preserve">code/reference/d18_pages.md</w:t>
+      </w:r>
+      <w:r>
+        <w:t xml:space="preserve"> </w:t>
+      </w:r>
+      <w:r>
+        <w:t xml:space="preserve">(Net profit, Latest quarter, Active lease, Below investment grade), published by the facilitator in the domain</w:t>
+      </w:r>
+      <w:r>
+        <w:t xml:space="preserve"> </w:t>
+      </w:r>
+      <w:r>
+        <w:t xml:space="preserve">“Revantage Workshop”</w:t>
+      </w:r>
+      <w:r>
+        <w:t xml:space="preserve"> </w:t>
+      </w:r>
+      <w:r>
+        <w:rPr>
+          <w:b/>
+          <w:bCs/>
+        </w:rPr>
+        <w:t xml:space="preserve">Starting state:</w:t>
+      </w:r>
+      <w:r>
+        <w:t xml:space="preserve"> </w:t>
+      </w:r>
+      <w:r>
+        <w:t xml:space="preserve">domain</w:t>
+      </w:r>
+      <w:r>
+        <w:t xml:space="preserve"> </w:t>
+      </w:r>
+      <w:r>
+        <w:rPr>
+          <w:b/>
+          <w:bCs/>
+        </w:rPr>
+        <w:t xml:space="preserve">Revantage Workshop</w:t>
+      </w:r>
+      <w:r>
+        <w:t xml:space="preserve"> </w:t>
+      </w:r>
+      <w:r>
+        <w:t xml:space="preserve">(governed tag</w:t>
+      </w:r>
+      <w:r>
+        <w:t xml:space="preserve"> </w:t>
+      </w:r>
+      <w:r>
+        <w:rPr>
+          <w:rStyle w:val="VerbatimChar"/>
+        </w:rPr>
+        <w:t xml:space="preserve">Revantage Workshop</w:t>
+      </w:r>
+      <w:r>
+        <w:t xml:space="preserve">, created by</w:t>
+      </w:r>
+      <w:r>
+        <w:t xml:space="preserve"> </w:t>
+      </w:r>
+      <w:r>
+        <w:rPr>
+          <w:rStyle w:val="VerbatimChar"/>
+        </w:rPr>
+        <w:t xml:space="preserve">code/scripts/d18_domain.sh</w:t>
+      </w:r>
+      <w:r>
+        <w:t xml:space="preserve">), participants with MANAGE on the domain; the Demo 7 metric views</w:t>
+      </w:r>
+      <w:r>
+        <w:t xml:space="preserve"> </w:t>
+      </w:r>
+      <w:r>
+        <w:rPr>
+          <w:rStyle w:val="VerbatimChar"/>
+        </w:rPr>
+        <w:t xml:space="preserve">ref_mv_*</w:t>
+      </w:r>
+      <w:r>
+        <w:t xml:space="preserve"> </w:t>
+      </w:r>
+      <w:r>
+        <w:t xml:space="preserve">(the domain’s</w:t>
+      </w:r>
+      <w:r>
+        <w:t xml:space="preserve"> </w:t>
+      </w:r>
+      <w:r>
+        <w:rPr>
+          <w:i/>
+          <w:iCs/>
+        </w:rPr>
+        <w:t xml:space="preserve">Metrics</w:t>
+      </w:r>
+      <w:r>
+        <w:t xml:space="preserve">); the Demo 17 tables</w:t>
+      </w:r>
+      <w:r>
+        <w:t xml:space="preserve"> </w:t>
+      </w:r>
+      <w:r>
+        <w:rPr>
+          <w:b/>
+          <w:bCs/>
+        </w:rPr>
+        <w:t xml:space="preserve">Where:</w:t>
+      </w:r>
+      <w:r>
+        <w:t xml:space="preserve"> </w:t>
+      </w:r>
+      <w:r>
+        <w:t xml:space="preserve">Discover (Domains, Pages); Genie One (Switch apps → Genie One, or the home page</w:t>
+      </w:r>
+      <w:r>
+        <w:t xml:space="preserve"> </w:t>
+      </w:r>
+      <w:r>
+        <w:rPr>
+          <w:b/>
+          <w:bCs/>
+        </w:rPr>
+        <w:t xml:space="preserve">Ask</w:t>
+      </w:r>
+      <w:r>
+        <w:t xml:space="preserve"> </w:t>
+      </w:r>
+      <w:r>
+        <w:t xml:space="preserve">box)</w:t>
+      </w:r>
+    </w:p>
+    <w:p>
+      <w:pPr>
+        <w:pStyle w:val="BodyText"/>
+      </w:pPr>
+      <w:r>
+        <w:t xml:space="preserve">The story: Demo 17 made one Genie Agent accurate. Genie One answers across</w:t>
+      </w:r>
+      <w:r>
+        <w:t xml:space="preserve"> </w:t>
+      </w:r>
+      <w:r>
+        <w:rPr>
+          <w:i/>
+          <w:iCs/>
+        </w:rPr>
+        <w:t xml:space="preserve">everything</w:t>
+      </w:r>
+      <w:r>
+        <w:t xml:space="preserve"> </w:t>
+      </w:r>
+      <w:r>
+        <w:t xml:space="preserve">you can see,</w:t>
+      </w:r>
+      <w:r>
+        <w:t xml:space="preserve"> </w:t>
+      </w:r>
+      <w:r>
+        <w:t xml:space="preserve">so it needs the business meaning to live where all tools find it.</w:t>
+      </w:r>
+      <w:r>
+        <w:t xml:space="preserve"> </w:t>
+      </w:r>
+      <w:r>
+        <w:rPr>
+          <w:b/>
+          <w:bCs/>
+        </w:rPr>
+        <w:t xml:space="preserve">Domains</w:t>
+      </w:r>
+      <w:r>
+        <w:t xml:space="preserve"> </w:t>
+      </w:r>
+      <w:r>
+        <w:t xml:space="preserve">organize assets by business</w:t>
+      </w:r>
+      <w:r>
+        <w:t xml:space="preserve"> </w:t>
+      </w:r>
+      <w:r>
+        <w:t xml:space="preserve">area,</w:t>
+      </w:r>
+      <w:r>
+        <w:t xml:space="preserve"> </w:t>
+      </w:r>
+      <w:r>
+        <w:rPr>
+          <w:b/>
+          <w:bCs/>
+        </w:rPr>
+        <w:t xml:space="preserve">Pages</w:t>
+      </w:r>
+      <w:r>
+        <w:t xml:space="preserve"> </w:t>
+      </w:r>
+      <w:r>
+        <w:t xml:space="preserve">explain a term (definition, synonyms, related assets),</w:t>
+      </w:r>
+      <w:r>
+        <w:t xml:space="preserve"> </w:t>
+      </w:r>
+      <w:r>
+        <w:rPr>
+          <w:b/>
+          <w:bCs/>
+        </w:rPr>
+        <w:t xml:space="preserve">metric views</w:t>
+      </w:r>
+      <w:r>
+        <w:t xml:space="preserve"> </w:t>
+      </w:r>
+      <w:r>
+        <w:t xml:space="preserve">calculate it, and</w:t>
+      </w:r>
+      <w:r>
+        <w:t xml:space="preserve"> </w:t>
+      </w:r>
+      <w:r>
+        <w:rPr>
+          <w:b/>
+          <w:bCs/>
+        </w:rPr>
+        <w:t xml:space="preserve">certification</w:t>
+      </w:r>
+      <w:r>
+        <w:t xml:space="preserve"> </w:t>
+      </w:r>
+      <w:r>
+        <w:t xml:space="preserve">says which asset to trust. Genie One searches them together (the</w:t>
+      </w:r>
+      <w:r>
+        <w:t xml:space="preserve"> </w:t>
+      </w:r>
+      <w:r>
+        <w:rPr>
+          <w:i/>
+          <w:iCs/>
+        </w:rPr>
+        <w:t xml:space="preserve">Genie Ontology</w:t>
+      </w:r>
+      <w:r>
+        <w:t xml:space="preserve">)</w:t>
+      </w:r>
+      <w:r>
+        <w:t xml:space="preserve"> </w:t>
+      </w:r>
+      <w:r>
+        <w:t xml:space="preserve">and prefers a Page’s human-written definition, but only when the trust signals agree.</w:t>
+      </w:r>
+    </w:p>
+    <w:p>
+      <w:pPr>
+        <w:pStyle w:val="CaptionedFigure"/>
+      </w:pPr>
+      <w:r>
+        <w:drawing>
+          <wp:inline>
+            <wp:extent cx="5334000" cy="5717381"/>
+            <wp:effectExtent b="0" l="0" r="0" t="0"/>
+            <wp:docPr descr="Genie One reads the Net profit Page (“Read info for: knowledge_page…”) before choosing a source." title="" id="185" name="Picture"/>
+            <a:graphic>
+              <a:graphicData uri="http://schemas.openxmlformats.org/drawingml/2006/picture">
+                <pic:pic>
+                  <pic:nvPicPr>
+                    <pic:cNvPr descr="../notes/agent-notes/screenshots/d18-genie-one-reads-page.png" id="186" name="Picture"/>
+                    <pic:cNvPicPr>
+                      <a:picLocks noChangeArrowheads="1" noChangeAspect="1"/>
+                    </pic:cNvPicPr>
+                  </pic:nvPicPr>
+                  <pic:blipFill>
+                    <a:blip r:embed="rId184"/>
+                    <a:stretch>
+                      <a:fillRect/>
+                    </a:stretch>
+                  </pic:blipFill>
+                  <pic:spPr bwMode="auto">
+                    <a:xfrm>
+                      <a:off x="0" y="0"/>
+                      <a:ext cx="5334000" cy="5717381"/>
+                    </a:xfrm>
+                    <a:prstGeom prst="rect">
+                      <a:avLst/>
+                    </a:prstGeom>
+                    <a:noFill/>
+                    <a:ln w="9525">
+                      <a:noFill/>
+                      <a:headEnd/>
+                      <a:tailEnd/>
+                    </a:ln>
+                  </pic:spPr>
+                </pic:pic>
+              </a:graphicData>
+            </a:graphic>
+          </wp:inline>
+        </w:drawing>
+      </w:r>
+    </w:p>
+    <w:p>
+      <w:pPr>
+        <w:pStyle w:val="ImageCaption"/>
+      </w:pPr>
+      <w:r>
+        <w:t xml:space="preserve">Genie One reads the Net profit Page (</w:t>
+      </w:r>
+      <w:r>
+        <w:t xml:space="preserve">“Read info for: knowledge_page…”</w:t>
+      </w:r>
+      <w:r>
+        <w:t xml:space="preserve">) before choosing a source.</w:t>
+      </w:r>
+    </w:p>
+    <w:p>
+      <w:pPr>
+        <w:pStyle w:val="BodyText"/>
+      </w:pPr>
+      <w:r>
+        <w:rPr>
+          <w:i/>
+          <w:iCs/>
+        </w:rPr>
+        <w:t xml:space="preserve">Genie One reads the Net profit Page (</w:t>
+      </w:r>
+      <w:r>
+        <w:rPr>
+          <w:i/>
+          <w:iCs/>
+        </w:rPr>
+        <w:t xml:space="preserve">“Read info for: knowledge_page…”</w:t>
+      </w:r>
+      <w:r>
+        <w:rPr>
+          <w:i/>
+          <w:iCs/>
+        </w:rPr>
+        <w:t xml:space="preserve">) before choosing a source.</w:t>
+      </w:r>
+    </w:p>
+    <w:bookmarkEnd w:id="187"/>
+    <w:bookmarkStart w:id="188" w:name="stage-1-tour-the-domain-4-min"/>
+    <w:p>
+      <w:pPr>
+        <w:pStyle w:val="Heading3"/>
+      </w:pPr>
+      <w:r>
+        <w:t xml:space="preserve">Stage 1: Tour the domain (4 min)</w:t>
+      </w:r>
+    </w:p>
+    <w:p>
+      <w:pPr>
+        <w:pStyle w:val="FirstParagraph"/>
+      </w:pPr>
+      <w:r>
+        <w:rPr>
+          <w:b/>
+          <w:bCs/>
+        </w:rPr>
+        <w:t xml:space="preserve">Discover</w:t>
+      </w:r>
+      <w:r>
+        <w:t xml:space="preserve"> </w:t>
+      </w:r>
+      <w:r>
+        <w:t xml:space="preserve">→</w:t>
+      </w:r>
+      <w:r>
+        <w:t xml:space="preserve"> </w:t>
+      </w:r>
+      <w:r>
+        <w:rPr>
+          <w:b/>
+          <w:bCs/>
+        </w:rPr>
+        <w:t xml:space="preserve">Browse by domain</w:t>
+      </w:r>
+      <w:r>
+        <w:t xml:space="preserve"> </w:t>
+      </w:r>
+      <w:r>
+        <w:t xml:space="preserve">→</w:t>
+      </w:r>
+      <w:r>
+        <w:t xml:space="preserve"> </w:t>
+      </w:r>
+      <w:r>
+        <w:rPr>
+          <w:b/>
+          <w:bCs/>
+        </w:rPr>
+        <w:t xml:space="preserve">Revantage Workshop</w:t>
+      </w:r>
+      <w:r>
+        <w:t xml:space="preserve">: the domain’s assets,</w:t>
+      </w:r>
+      <w:r>
+        <w:t xml:space="preserve"> </w:t>
+      </w:r>
+      <w:r>
+        <w:rPr>
+          <w:b/>
+          <w:bCs/>
+        </w:rPr>
+        <w:t xml:space="preserve">Featured Metric views</w:t>
+      </w:r>
+      <w:r>
+        <w:t xml:space="preserve"> </w:t>
+      </w:r>
+      <w:r>
+        <w:t xml:space="preserve">(the</w:t>
+      </w:r>
+      <w:r>
+        <w:t xml:space="preserve"> </w:t>
+      </w:r>
+      <w:r>
+        <w:rPr>
+          <w:rStyle w:val="VerbatimChar"/>
+        </w:rPr>
+        <w:t xml:space="preserve">ref_mv_*</w:t>
+      </w:r>
+      <w:r>
+        <w:t xml:space="preserve"> </w:t>
+      </w:r>
+      <w:r>
+        <w:t xml:space="preserve">views: the domain’s</w:t>
+      </w:r>
+      <w:r>
+        <w:t xml:space="preserve"> </w:t>
+      </w:r>
+      <w:r>
+        <w:rPr>
+          <w:i/>
+          <w:iCs/>
+        </w:rPr>
+        <w:t xml:space="preserve">Metrics</w:t>
+      </w:r>
+      <w:r>
+        <w:t xml:space="preserve">),</w:t>
+      </w:r>
+      <w:r>
+        <w:t xml:space="preserve"> </w:t>
+      </w:r>
+      <w:r>
+        <w:rPr>
+          <w:b/>
+          <w:bCs/>
+        </w:rPr>
+        <w:t xml:space="preserve">Pages</w:t>
+      </w:r>
+      <w:r>
+        <w:t xml:space="preserve">, and</w:t>
+      </w:r>
+      <w:r>
+        <w:t xml:space="preserve"> </w:t>
+      </w:r>
+      <w:r>
+        <w:rPr>
+          <w:b/>
+          <w:bCs/>
+        </w:rPr>
+        <w:t xml:space="preserve">Ask Genie</w:t>
+      </w:r>
+      <w:r>
+        <w:t xml:space="preserve"> </w:t>
+      </w:r>
+      <w:r>
+        <w:t xml:space="preserve">(a Genie scoped to the domain).</w:t>
+      </w:r>
+      <w:r>
+        <w:t xml:space="preserve"> </w:t>
+      </w:r>
+      <w:r>
+        <w:rPr>
+          <w:b/>
+          <w:bCs/>
+        </w:rPr>
+        <w:t xml:space="preserve">Teach:</w:t>
+      </w:r>
+      <w:r>
+        <w:t xml:space="preserve"> </w:t>
+      </w:r>
+      <w:r>
+        <w:t xml:space="preserve">a domain is backed by a governed tag; tagging a table, metric view, dashboard or Genie Agent with it (or</w:t>
+      </w:r>
+      <w:r>
+        <w:t xml:space="preserve"> </w:t>
+      </w:r>
+      <w:r>
+        <w:rPr>
+          <w:b/>
+          <w:bCs/>
+        </w:rPr>
+        <w:t xml:space="preserve">Add to domain</w:t>
+      </w:r>
+      <w:r>
+        <w:t xml:space="preserve">) puts it in the domain. Pages inherit the domain’s permissions.</w:t>
+      </w:r>
+    </w:p>
+    <w:bookmarkEnd w:id="188"/>
+    <w:bookmarkStart w:id="189" w:name="stage-2-ask-before-you-define-4-min"/>
+    <w:p>
+      <w:pPr>
+        <w:pStyle w:val="Heading3"/>
+      </w:pPr>
+      <w:r>
+        <w:t xml:space="preserve">Stage 2: Ask before you define (4 min)</w:t>
+      </w:r>
+    </w:p>
+    <w:p>
+      <w:pPr>
+        <w:pStyle w:val="FirstParagraph"/>
+      </w:pPr>
+      <w:r>
+        <w:rPr>
+          <w:b/>
+          <w:bCs/>
+        </w:rPr>
+        <w:t xml:space="preserve">Prompt</w:t>
+      </w:r>
+      <w:r>
+        <w:t xml:space="preserve"> </w:t>
+      </w:r>
+      <w:r>
+        <w:t xml:space="preserve">(Genie One, new chat):</w:t>
+      </w:r>
+      <w:r>
+        <w:t xml:space="preserve"> </w:t>
+      </w:r>
+      <w:r>
+        <w:t xml:space="preserve">&gt; What is our NOI this quarter?</w:t>
+      </w:r>
+    </w:p>
+    <w:p>
+      <w:pPr>
+        <w:pStyle w:val="BodyText"/>
+      </w:pPr>
+      <w:r>
+        <w:rPr>
+          <w:b/>
+          <w:bCs/>
+        </w:rPr>
+        <w:t xml:space="preserve">Expected:</w:t>
+      </w:r>
+      <w:r>
+        <w:t xml:space="preserve"> </w:t>
+      </w:r>
+      <w:r>
+        <w:t xml:space="preserve">open</w:t>
+      </w:r>
+      <w:r>
+        <w:t xml:space="preserve"> </w:t>
+      </w:r>
+      <w:r>
+        <w:rPr>
+          <w:b/>
+          <w:bCs/>
+        </w:rPr>
+        <w:t xml:space="preserve">Thought process</w:t>
+      </w:r>
+      <w:r>
+        <w:t xml:space="preserve">: Genie One searches the ontology (</w:t>
+      </w:r>
+      <w:r>
+        <w:t xml:space="preserve">“Found … ontology results”</w:t>
+      </w:r>
+      <w:r>
+        <w:t xml:space="preserve">), picks a metric view and a quarter, and shows its sources. Check</w:t>
+      </w:r>
+      <w:r>
+        <w:t xml:space="preserve"> </w:t>
+      </w:r>
+      <w:r>
+        <w:rPr>
+          <w:i/>
+          <w:iCs/>
+        </w:rPr>
+        <w:t xml:space="preserve">which</w:t>
+      </w:r>
+      <w:r>
+        <w:t xml:space="preserve"> </w:t>
+      </w:r>
+      <w:r>
+        <w:t xml:space="preserve">definition and</w:t>
+      </w:r>
+      <w:r>
+        <w:t xml:space="preserve"> </w:t>
+      </w:r>
+      <w:r>
+        <w:rPr>
+          <w:i/>
+          <w:iCs/>
+        </w:rPr>
+        <w:t xml:space="preserve">which</w:t>
+      </w:r>
+      <w:r>
+        <w:t xml:space="preserve"> </w:t>
+      </w:r>
+      <w:r>
+        <w:t xml:space="preserve">quarter it used. Without a Page it has to guess that NOI means net profit and that</w:t>
+      </w:r>
+      <w:r>
+        <w:t xml:space="preserve"> </w:t>
+      </w:r>
+      <w:r>
+        <w:t xml:space="preserve">“this quarter”</w:t>
+      </w:r>
+      <w:r>
+        <w:t xml:space="preserve"> </w:t>
+      </w:r>
+      <w:r>
+        <w:t xml:space="preserve">means the latest complete quarter (2026-Q2), not the calendar quarter.</w:t>
+      </w:r>
+    </w:p>
+    <w:bookmarkEnd w:id="189"/>
+    <w:bookmarkStart w:id="190" w:name="Xe481cc9e024a8f34d2c2d5a03d8bb9fd0f8fb3e"/>
+    <w:p>
+      <w:pPr>
+        <w:pStyle w:val="Heading3"/>
+      </w:pPr>
+      <w:r>
+        <w:t xml:space="preserve">Stage 3: Write the Page with Genie Code (8 min)</w:t>
+      </w:r>
+    </w:p>
+    <w:p>
+      <w:pPr>
+        <w:pStyle w:val="FirstParagraph"/>
+      </w:pPr>
+      <w:r>
+        <w:rPr>
+          <w:b/>
+          <w:bCs/>
+        </w:rPr>
+        <w:t xml:space="preserve">Discover → Create → Create page</w:t>
+      </w:r>
+      <w:r>
+        <w:t xml:space="preserve"> </w:t>
+      </w:r>
+      <w:r>
+        <w:t xml:space="preserve">→ in the Genie Code panel click</w:t>
+      </w:r>
+      <w:r>
+        <w:t xml:space="preserve"> </w:t>
+      </w:r>
+      <w:r>
+        <w:rPr>
+          <w:b/>
+          <w:bCs/>
+        </w:rPr>
+        <w:t xml:space="preserve">Help me create a new page</w:t>
+      </w:r>
+      <w:r>
+        <w:t xml:space="preserve"> </w:t>
+      </w:r>
+      <w:r>
+        <w:t xml:space="preserve">(or type):</w:t>
+      </w:r>
+      <w:r>
+        <w:t xml:space="preserve"> </w:t>
+      </w:r>
+      <w:r>
+        <w:t xml:space="preserve">&gt; Help me create a page</w:t>
+      </w:r>
+      <w:r>
+        <w:t xml:space="preserve"> </w:t>
+      </w:r>
+      <w:r>
+        <w:t xml:space="preserve">“Net profit (</w:t>
+      </w:r>
+      <w:r>
+        <w:t xml:space="preserve">)”</w:t>
+      </w:r>
+      <w:r>
+        <w:t xml:space="preserve"> </w:t>
+      </w:r>
+      <w:r>
+        <w:t xml:space="preserve">in the Revantage Workshop domain. Description: Revantage’s approved Finance net profit: revenue minus operating expense minus management fee; CapEx and intercompany recharges are not deducted. Definition: per property and fiscal quarter in EUR; in the general ledger account_class R - O - M.</w:t>
+      </w:r>
+      <w:r>
+        <w:t xml:space="preserve"> </w:t>
+      </w:r>
+      <w:r>
+        <w:t xml:space="preserve">“This quarter”</w:t>
+      </w:r>
+      <w:r>
+        <w:t xml:space="preserve"> </w:t>
+      </w:r>
+      <w:r>
+        <w:t xml:space="preserve">means the latest complete fiscal quarter in the workshop data, 2026-Q2. The authoritative source is the metric view</w:t>
+      </w:r>
+      <w:r>
+        <w:t xml:space="preserve"> </w:t>
+      </w:r>
+      <w:r>
+        <w:t xml:space="preserve">.</w:t>
+      </w:r>
+      <w:r>
+        <w:t xml:space="preserve">.ref_mv_net_profit_margin over gold_property_quarterly. Synonyms: NOI, net operating income, bottom line. Related assets:</w:t>
+      </w:r>
+      <w:r>
+        <w:t xml:space="preserve"> </w:t>
+      </w:r>
+      <w:r>
+        <w:t xml:space="preserve">.</w:t>
+      </w:r>
+      <w:r>
+        <w:t xml:space="preserve">.ref_mv_net_profit_margin and</w:t>
+      </w:r>
+      <w:r>
+        <w:t xml:space="preserve"> </w:t>
+      </w:r>
+      <w:r>
+        <w:t xml:space="preserve">.</w:t>
+      </w:r>
+      <w:r>
+        <w:t xml:space="preserve">.gold_property_quarterly. Fill in the page fields but don’t publish.</w:t>
+      </w:r>
+    </w:p>
+    <w:p>
+      <w:pPr>
+        <w:pStyle w:val="BodyText"/>
+      </w:pPr>
+      <w:r>
+        <w:rPr>
+          <w:b/>
+          <w:bCs/>
+        </w:rPr>
+        <w:t xml:space="preserve">Expected:</w:t>
+      </w:r>
+      <w:r>
+        <w:t xml:space="preserve"> </w:t>
+      </w:r>
+      <w:r>
+        <w:t xml:space="preserve">Genie Code finds the domain and fills the form: name, domain, 3 synonyms, description, a body with</w:t>
+      </w:r>
+      <w:r>
+        <w:t xml:space="preserve"> </w:t>
+      </w:r>
+      <w:r>
+        <w:rPr>
+          <w:i/>
+          <w:iCs/>
+        </w:rPr>
+        <w:t xml:space="preserve">Definition</w:t>
+      </w:r>
+      <w:r>
+        <w:t xml:space="preserve">,</w:t>
+      </w:r>
+      <w:r>
+        <w:t xml:space="preserve"> </w:t>
+      </w:r>
+      <w:r>
+        <w:rPr>
+          <w:i/>
+          <w:iCs/>
+        </w:rPr>
+        <w:t xml:space="preserve">Authoritative source</w:t>
+      </w:r>
+      <w:r>
+        <w:t xml:space="preserve"> </w:t>
+      </w:r>
+      <w:r>
+        <w:t xml:space="preserve">and</w:t>
+      </w:r>
+      <w:r>
+        <w:t xml:space="preserve"> </w:t>
+      </w:r>
+      <w:r>
+        <w:rPr>
+          <w:i/>
+          <w:iCs/>
+        </w:rPr>
+        <w:t xml:space="preserve">Business use</w:t>
+      </w:r>
+      <w:r>
+        <w:t xml:space="preserve">, and both</w:t>
+      </w:r>
+      <w:r>
+        <w:t xml:space="preserve"> </w:t>
+      </w:r>
+      <w:r>
+        <w:rPr>
+          <w:b/>
+          <w:bCs/>
+        </w:rPr>
+        <w:t xml:space="preserve">Related assets</w:t>
+      </w:r>
+      <w:r>
+        <w:t xml:space="preserve"> </w:t>
+      </w:r>
+      <w:r>
+        <w:t xml:space="preserve">(the metric view and the table). Review it →</w:t>
+      </w:r>
+      <w:r>
+        <w:t xml:space="preserve"> </w:t>
+      </w:r>
+      <w:r>
+        <w:rPr>
+          <w:b/>
+          <w:bCs/>
+        </w:rPr>
+        <w:t xml:space="preserve">Save as draft</w:t>
+      </w:r>
+      <w:r>
+        <w:t xml:space="preserve"> </w:t>
+      </w:r>
+      <w:r>
+        <w:t xml:space="preserve">(a draft is used for you only; the facilitator’s published Pages are used for everyone).</w:t>
+      </w:r>
+      <w:r>
+        <w:t xml:space="preserve"> </w:t>
+      </w:r>
+      <w:r>
+        <w:rPr>
+          <w:b/>
+          <w:bCs/>
+        </w:rPr>
+        <w:t xml:space="preserve">If stuck:</w:t>
+      </w:r>
+      <w:r>
+        <w:t xml:space="preserve"> </w:t>
+      </w:r>
+      <w:r>
+        <w:t xml:space="preserve">copy the</w:t>
+      </w:r>
+      <w:r>
+        <w:t xml:space="preserve"> </w:t>
+      </w:r>
+      <w:r>
+        <w:t xml:space="preserve">“Net profit”</w:t>
+      </w:r>
+      <w:r>
+        <w:t xml:space="preserve"> </w:t>
+      </w:r>
+      <w:r>
+        <w:t xml:space="preserve">entry of</w:t>
+      </w:r>
+      <w:r>
+        <w:t xml:space="preserve"> </w:t>
+      </w:r>
+      <w:r>
+        <w:rPr>
+          <w:rStyle w:val="VerbatimChar"/>
+        </w:rPr>
+        <w:t xml:space="preserve">code/reference/d18_pages.md</w:t>
+      </w:r>
+      <w:r>
+        <w:t xml:space="preserve"> </w:t>
+      </w:r>
+      <w:r>
+        <w:t xml:space="preserve">into the form by hand.</w:t>
+      </w:r>
+      <w:r>
+        <w:t xml:space="preserve"> </w:t>
+      </w:r>
+      <w:r>
+        <w:rPr>
+          <w:b/>
+          <w:bCs/>
+        </w:rPr>
+        <w:t xml:space="preserve">Watch for:</w:t>
+      </w:r>
+      <w:r>
+        <w:t xml:space="preserve"> </w:t>
+      </w:r>
+      <w:r>
+        <w:t xml:space="preserve">Page content is stored in plain text and replicated globally: never put PII or confidential figures in a Page.</w:t>
+      </w:r>
+    </w:p>
+    <w:bookmarkEnd w:id="190"/>
+    <w:bookmarkStart w:id="191" w:name="stage-4-ask-again-4-min"/>
+    <w:p>
+      <w:pPr>
+        <w:pStyle w:val="Heading3"/>
+      </w:pPr>
+      <w:r>
+        <w:t xml:space="preserve">Stage 4: Ask again (4 min)</w:t>
+      </w:r>
+    </w:p>
+    <w:p>
+      <w:pPr>
+        <w:pStyle w:val="FirstParagraph"/>
+      </w:pPr>
+      <w:r>
+        <w:rPr>
+          <w:b/>
+          <w:bCs/>
+        </w:rPr>
+        <w:t xml:space="preserve">Prompt</w:t>
+      </w:r>
+      <w:r>
+        <w:t xml:space="preserve"> </w:t>
+      </w:r>
+      <w:r>
+        <w:t xml:space="preserve">(Genie One,</w:t>
+      </w:r>
+      <w:r>
+        <w:t xml:space="preserve"> </w:t>
+      </w:r>
+      <w:r>
+        <w:rPr>
+          <w:b/>
+          <w:bCs/>
+        </w:rPr>
+        <w:t xml:space="preserve">new</w:t>
+      </w:r>
+      <w:r>
+        <w:t xml:space="preserve"> </w:t>
+      </w:r>
+      <w:r>
+        <w:t xml:space="preserve">chat, so it doesn’t reuse the previous one):</w:t>
+      </w:r>
+      <w:r>
+        <w:t xml:space="preserve"> </w:t>
+      </w:r>
+      <w:r>
+        <w:t xml:space="preserve">&gt; What is our NOI this quarter?</w:t>
+      </w:r>
+    </w:p>
+    <w:p>
+      <w:pPr>
+        <w:pStyle w:val="BodyText"/>
+      </w:pPr>
+      <w:r>
+        <w:rPr>
+          <w:b/>
+          <w:bCs/>
+        </w:rPr>
+        <w:t xml:space="preserve">Expected:</w:t>
+      </w:r>
+      <w:r>
+        <w:t xml:space="preserve"> </w:t>
+      </w:r>
+      <w:r>
+        <w:rPr>
+          <w:b/>
+          <w:bCs/>
+        </w:rPr>
+        <w:t xml:space="preserve">Thought process</w:t>
+      </w:r>
+      <w:r>
+        <w:t xml:space="preserve"> </w:t>
+      </w:r>
+      <w:r>
+        <w:t xml:space="preserve">shows</w:t>
+      </w:r>
+      <w:r>
+        <w:t xml:space="preserve"> </w:t>
+      </w:r>
+      <w:r>
+        <w:rPr>
+          <w:b/>
+          <w:bCs/>
+        </w:rPr>
+        <w:t xml:space="preserve">Read info for: knowledge_page…</w:t>
+      </w:r>
+      <w:r>
+        <w:t xml:space="preserve"> </w:t>
+      </w:r>
+      <w:r>
+        <w:t xml:space="preserve">and the answer says NOI is net profit</w:t>
+      </w:r>
+      <w:r>
+        <w:t xml:space="preserve"> </w:t>
+      </w:r>
+      <w:r>
+        <w:t xml:space="preserve">“per the glossary page”</w:t>
+      </w:r>
+      <w:r>
+        <w:t xml:space="preserve">. With the Page and a single certified metric view, the expected answer is</w:t>
+      </w:r>
+      <w:r>
+        <w:t xml:space="preserve"> </w:t>
+      </w:r>
+      <w:r>
+        <w:rPr>
+          <w:b/>
+          <w:bCs/>
+        </w:rPr>
+        <w:t xml:space="preserve">€6,375,345.36 for 2026-Q2</w:t>
+      </w:r>
+      <w:r>
+        <w:t xml:space="preserve"> </w:t>
+      </w:r>
+      <w:r>
+        <w:t xml:space="preserve">from</w:t>
+      </w:r>
+      <w:r>
+        <w:t xml:space="preserve"> </w:t>
+      </w:r>
+      <w:r>
+        <w:rPr>
+          <w:rStyle w:val="VerbatimChar"/>
+        </w:rPr>
+        <w:t xml:space="preserve">ref_mv_net_profit_margin</w:t>
+      </w:r>
+      <w:r>
+        <w:t xml:space="preserve"> </w:t>
+      </w:r>
+      <w:r>
+        <w:t xml:space="preserve">(to confirm in the Revantage workspace pre-flight).</w:t>
+      </w:r>
+      <w:r>
+        <w:t xml:space="preserve"> </w:t>
+      </w:r>
+      <w:r>
+        <w:rPr>
+          <w:b/>
+          <w:bCs/>
+        </w:rPr>
+        <w:t xml:space="preserve">Teach:</w:t>
+      </w:r>
+      <w:r>
+        <w:t xml:space="preserve"> </w:t>
+      </w:r>
+      <w:r>
+        <w:t xml:space="preserve">if Genie One still prefers another asset, it tells you why in the thought process (</w:t>
+      </w:r>
+      <w:r>
+        <w:t xml:space="preserve">“two competing sources of truth”</w:t>
+      </w:r>
+      <w:r>
+        <w:t xml:space="preserve">): another</w:t>
+      </w:r>
+      <w:r>
+        <w:t xml:space="preserve"> </w:t>
+      </w:r>
+      <w:r>
+        <w:rPr>
+          <w:i/>
+          <w:iCs/>
+        </w:rPr>
+        <w:t xml:space="preserve">certified</w:t>
+      </w:r>
+      <w:r>
+        <w:t xml:space="preserve"> </w:t>
+      </w:r>
+      <w:r>
+        <w:t xml:space="preserve">view with a different definition or later data. The fix is trust hygiene, not a better prompt: certify the right metric view (</w:t>
+      </w:r>
+      <w:r>
+        <w:rPr>
+          <w:rStyle w:val="VerbatimChar"/>
+        </w:rPr>
+        <w:t xml:space="preserve">system.certification_status</w:t>
+      </w:r>
+      <w:r>
+        <w:t xml:space="preserve">, Demo 10), deprecate the other, and list the right one as the Page’s related asset.</w:t>
+      </w:r>
+    </w:p>
+    <w:bookmarkEnd w:id="191"/>
+    <w:bookmarkStart w:id="192" w:name="X4e819a8e15b8131738425be63266f498e15196f"/>
+    <w:p>
+      <w:pPr>
+        <w:pStyle w:val="Heading3"/>
+      </w:pPr>
+      <w:r>
+        <w:t xml:space="preserve">Stage 5: Metrics in the domain, and what Pages don’t do (5 min)</w:t>
+      </w:r>
+    </w:p>
+    <w:p>
+      <w:pPr>
+        <w:pStyle w:val="Compact"/>
+        <w:numPr>
+          <w:ilvl w:val="0"/>
+          <w:numId w:val="1032"/>
+        </w:numPr>
+      </w:pPr>
+      <w:r>
+        <w:rPr>
+          <w:b/>
+          <w:bCs/>
+        </w:rPr>
+        <w:t xml:space="preserve">Domain → Add to domain</w:t>
+      </w:r>
+      <w:r>
+        <w:t xml:space="preserve"> </w:t>
+      </w:r>
+      <w:r>
+        <w:t xml:space="preserve">(or</w:t>
+      </w:r>
+      <w:r>
+        <w:t xml:space="preserve"> </w:t>
+      </w:r>
+      <w:r>
+        <w:rPr>
+          <w:rStyle w:val="VerbatimChar"/>
+        </w:rPr>
+        <w:t xml:space="preserve">ALTER VIEW … SET TAGS ('Revantage Workshop')</w:t>
+      </w:r>
+      <w:r>
+        <w:t xml:space="preserve">): add your Demo 7 metric views; they appear under the domain’s metric views. Then try the domain’s</w:t>
+      </w:r>
+      <w:r>
+        <w:t xml:space="preserve"> </w:t>
+      </w:r>
+      <w:r>
+        <w:rPr>
+          <w:b/>
+          <w:bCs/>
+        </w:rPr>
+        <w:t xml:space="preserve">Ask Genie</w:t>
+      </w:r>
+      <w:r>
+        <w:t xml:space="preserve">: it answers from the domain’s assets only.</w:t>
+      </w:r>
+    </w:p>
+    <w:p>
+      <w:pPr>
+        <w:pStyle w:val="Compact"/>
+        <w:numPr>
+          <w:ilvl w:val="0"/>
+          <w:numId w:val="1032"/>
+        </w:numPr>
+      </w:pPr>
+      <w:r>
+        <w:rPr>
+          <w:b/>
+          <w:bCs/>
+        </w:rPr>
+        <w:t xml:space="preserve">Pages feed Genie One and Genie Code, not Genie Agents.</w:t>
+      </w:r>
+      <w:r>
+        <w:t xml:space="preserve"> </w:t>
+      </w:r>
+      <w:r>
+        <w:t xml:space="preserve">A Genie Agent answers from its own data and configuration: the same Demo 17 agent without metric views or instructions scored</w:t>
+      </w:r>
+      <w:r>
+        <w:t xml:space="preserve"> </w:t>
+      </w:r>
+      <w:r>
+        <w:rPr>
+          <w:b/>
+          <w:bCs/>
+        </w:rPr>
+        <w:t xml:space="preserve">50% with and without</w:t>
+      </w:r>
+      <w:r>
+        <w:t xml:space="preserve"> </w:t>
+      </w:r>
+      <w:r>
+        <w:t xml:space="preserve">the Net profit Page. For an agent, the definition goes into comments, metric views and instructions (Demo 17); for everyone else, into a Page.</w:t>
+      </w:r>
+    </w:p>
+    <w:bookmarkEnd w:id="192"/>
+    <w:bookmarkStart w:id="193" w:name="reset-facilitator-after-the-session-2"/>
+    <w:p>
+      <w:pPr>
+        <w:pStyle w:val="Heading3"/>
+      </w:pPr>
+      <w:r>
+        <w:t xml:space="preserve">6. Reset (facilitator, after the session)</w:t>
+      </w:r>
+    </w:p>
+    <w:p>
+      <w:pPr>
+        <w:pStyle w:val="FirstParagraph"/>
+      </w:pPr>
+      <w:r>
+        <w:t xml:space="preserve">Delete participants’ draft Pages (Discover → Pages → Owned by … → ⋮ → Delete) or leave them: drafts are private to their owner. The reference Pages and the domain stay until teardown (</w:t>
+      </w:r>
+      <w:r>
+        <w:rPr>
+          <w:rStyle w:val="VerbatimChar"/>
+        </w:rPr>
+        <w:t xml:space="preserve">code/scripts/d18_domain.sh --teardown</w:t>
+      </w:r>
+      <w:r>
+        <w:t xml:space="preserve">).</w:t>
+      </w:r>
+    </w:p>
+    <w:bookmarkEnd w:id="193"/>
+    <w:bookmarkStart w:id="194" w:name="wrap-up-16"/>
+    <w:p>
+      <w:pPr>
+        <w:pStyle w:val="Heading3"/>
+      </w:pPr>
+      <w:r>
+        <w:t xml:space="preserve">Wrap-up</w:t>
+      </w:r>
+    </w:p>
+    <w:p>
+      <w:pPr>
+        <w:pStyle w:val="Compact"/>
+        <w:numPr>
+          <w:ilvl w:val="0"/>
+          <w:numId w:val="1033"/>
+        </w:numPr>
+      </w:pPr>
+      <w:r>
+        <w:rPr>
+          <w:b/>
+          <w:bCs/>
+        </w:rPr>
+        <w:t xml:space="preserve">So what:</w:t>
+      </w:r>
+      <w:r>
+        <w:t xml:space="preserve"> </w:t>
+      </w:r>
+      <w:r>
+        <w:t xml:space="preserve">one place for what your words mean. Write the definition once (Page), compute it once (metric view), trust it once (certification), organize it by business area (domain); every Genie surface then answers the same way.</w:t>
+      </w:r>
+    </w:p>
+    <w:p>
+      <w:pPr>
+        <w:pStyle w:val="Compact"/>
+        <w:numPr>
+          <w:ilvl w:val="0"/>
+          <w:numId w:val="1033"/>
+        </w:numPr>
+      </w:pPr>
+      <w:r>
+        <w:rPr>
+          <w:b/>
+          <w:bCs/>
+        </w:rPr>
+        <w:t xml:space="preserve">Snowflake equivalent:</w:t>
+      </w:r>
+      <w:r>
+        <w:t xml:space="preserve"> </w:t>
+      </w:r>
+      <w:r>
+        <w:t xml:space="preserve">Horizon catalog tags and semantic views; here the business glossary, the metric layer and the AI assistant share one ontology in Unity Catalog.</w:t>
+      </w:r>
+    </w:p>
+    <w:p>
+      <w:pPr>
+        <w:pStyle w:val="Compact"/>
+        <w:numPr>
+          <w:ilvl w:val="0"/>
+          <w:numId w:val="1033"/>
+        </w:numPr>
+      </w:pPr>
+      <w:r>
+        <w:rPr>
+          <w:b/>
+          <w:bCs/>
+        </w:rPr>
+        <w:t xml:space="preserve">Verified:</w:t>
+      </w:r>
+      <w:r>
+        <w:t xml:space="preserve"> </w:t>
+      </w:r>
+      <w:r>
+        <w:t xml:space="preserve">2026-10-10 on the FEVM workspace (the account is at its governed-tag limit, so no new domain there; the Page was created as a draft in an existing domain): Genie Code filled the Page form from the Stage 3 prompt (domain, 3 synonyms, description, body, 2 related assets) and the draft saved. Genie One then read it (</w:t>
+      </w:r>
+      <w:r>
+        <w:t xml:space="preserve">“Read info for: knowledge_page.68801114…”</w:t>
+      </w:r>
+      <w:r>
+        <w:t xml:space="preserve">, NOI</w:t>
+      </w:r>
+      <w:r>
+        <w:t xml:space="preserve"> </w:t>
+      </w:r>
+      <w:r>
+        <w:t xml:space="preserve">“synonymous with net profit per the glossary page”</w:t>
+      </w:r>
+      <w:r>
+        <w:t xml:space="preserve">), but on FEVM kept another project’s</w:t>
+      </w:r>
+      <w:r>
+        <w:t xml:space="preserve"> </w:t>
+      </w:r>
+      <w:r>
+        <w:rPr>
+          <w:i/>
+          <w:iCs/>
+        </w:rPr>
+        <w:t xml:space="preserve">certified</w:t>
+      </w:r>
+      <w:r>
+        <w:t xml:space="preserve"> </w:t>
+      </w:r>
+      <w:r>
+        <w:rPr>
+          <w:rStyle w:val="VerbatimChar"/>
+        </w:rPr>
+        <w:t xml:space="preserve">net_profit_metrics</w:t>
+      </w:r>
+      <w:r>
+        <w:t xml:space="preserve"> </w:t>
+      </w:r>
+      <w:r>
+        <w:t xml:space="preserve">view with later data (2026-Q3, €54.5M) and said so: the conflicting-trust case of Stage 4. Genie Agent check: 10/20 with the Page, 10/20 without (</w:t>
+      </w:r>
+      <w:r>
+        <w:rPr>
+          <w:rStyle w:val="VerbatimChar"/>
+        </w:rPr>
+        <w:t xml:space="preserve">code/tests/score_genie.py</w:t>
+      </w:r>
+      <w:r>
+        <w:t xml:space="preserve">).</w:t>
+      </w:r>
+      <w:r>
+        <w:t xml:space="preserve"> </w:t>
+      </w:r>
+      <w:r>
+        <w:rPr>
+          <w:b/>
+          <w:bCs/>
+        </w:rPr>
+        <w:t xml:space="preserve">Pending (Revantage workspace):</w:t>
+      </w:r>
+      <w:r>
+        <w:t xml:space="preserve"> </w:t>
+      </w:r>
+      <w:r>
+        <w:t xml:space="preserve">domain creation by script, Add to domain, the domain’s Ask Genie, and Stage 4’s clean answer without a competing certified view.</w:t>
+      </w:r>
+    </w:p>
+    <w:bookmarkEnd w:id="194"/>
+    <w:bookmarkEnd w:id="195"/>
+    <w:bookmarkEnd w:id="196"/>
     <w:sectPr/>
   </w:body>
 </w:document>
@@ -21209,6 +25129,18 @@
     <w:abstractNumId w:val="991"/>
   </w:num>
   <w:num w:numId="1029">
+    <w:abstractNumId w:val="991"/>
+  </w:num>
+  <w:num w:numId="1030">
+    <w:abstractNumId w:val="991"/>
+  </w:num>
+  <w:num w:numId="1031">
+    <w:abstractNumId w:val="991"/>
+  </w:num>
+  <w:num w:numId="1032">
+    <w:abstractNumId w:val="991"/>
+  </w:num>
+  <w:num w:numId="1033">
     <w:abstractNumId w:val="991"/>
   </w:num>
 </w:numbering>

</xml_diff>